<commit_message>
Mise a jour du PTA et nouveau plan budgetise CLIN PCI CHUMEL 2026-2027 integrant les activites modifiees et ajoutees
Co-authored-by: arena-agent <297053741+arena-agent@users.noreply.github.com>
</commit_message>
<xml_diff>
--- a/Proposition de PTA CLIN PCI CHUMEL 2026-2027.docx
+++ b/Proposition de PTA CLIN PCI CHUMEL 2026-2027.docx
@@ -50,7 +50,7 @@
         </w:rPr>
         <w:t>PLAN DE TRAVAIL ANNUEL (PTA) CLIN / PCI 2026-2027</w:t>
         <w:br/>
-        <w:t>PROPOSITION DE PLAN OPÉRATIONNEL</w:t>
+        <w:t>PROPOSITION DE PLAN OPÉRATIONNEL (RÉAJUSTÉ)</w:t>
       </w:r>
     </w:p>
     <w:tbl>
@@ -211,13 +211,13 @@
                 <w:color w:val="1B365D"/>
                 <w:sz w:val="18"/>
               </w:rPr>
-              <w:t xml:space="preserve">Cadre de référence : </w:t>
+              <w:t xml:space="preserve">Version : </w:t>
             </w:r>
             <w:r>
               <w:rPr>
                 <w:sz w:val="18"/>
               </w:rPr>
-              <w:t>8 Composantes clés de l'OMS en PCI &amp; Diagnostic institutionnel</w:t>
+              <w:t>Proposition réajustée intégrant les nouvelles activités et orientations 2026-2027</w:t>
             </w:r>
           </w:p>
         </w:tc>
@@ -246,7 +246,7 @@
               <w:rPr>
                 <w:sz w:val="18"/>
               </w:rPr>
-              <w:t>Proposition soumise pour validation institutionnelle</w:t>
+              <w:t>Document final consolidé soumis pour approbation institutionnelle</w:t>
             </w:r>
           </w:p>
         </w:tc>
@@ -267,30 +267,24 @@
           <w:color w:val="1B365D"/>
           <w:sz w:val="22"/>
         </w:rPr>
-        <w:t>1. Contexte, Vision et Architecture Stratégique</w:t>
+        <w:t>1. Contexte, Évolutions et Synthèse des Réajustements</w:t>
         <w:br/>
       </w:r>
       <w:r>
         <w:rPr>
           <w:sz w:val="17"/>
         </w:rPr>
-        <w:t>Le Centre Hospitalier Universitaire de la Mère et de l'Enfant Lagune (CHU-MEL) de Cotonou a fait de la sécurité des soins et de la Prévention et du Contrôle des Infections (PCI) une priorité cardinale. En application des directives nationales et des recommandations internationales de l'Organisation Mondiale de la Santé (OMS), le présent Plan de Travail Annuel (PTA) 2026-2027 structure l'ensemble des interventions prioritaires du CLIN et de l'EOPCI autour des huit (8) Objectifs Stratégiques (OS) identifiés :</w:t>
+        <w:t>La présente version réajustée du Plan de Travail Annuel (PTA) CLIN/PCI 2026-2027 du CHU-MEL intègre pleinement les ajouts et reformulations stratégiques apportés au document initial :</w:t>
         <w:br/>
-        <w:t>• OS I - Programme PCI : Consolidation institutionnelle, nomination du Point Focal, renouvellement du CLIN et de l'EOPCI, équipe dédiée et intégration au PITA 2027.</w:t>
+        <w:t>1. Intégration de la Gouvernance sous l'OS I : Les réunions hebdomadaires de l'EOPCI et les sessions trimestrielles du CLIN sont désormais rattachées à l'OS I en tant qu'intervention 1.2, renforçant la cohérence du pilotage institutionnel avec le cahier des charges de l'EOPCI, les fiches de tâches, le réseau de 24 points focaux médico-techniques et le recours à une expertise externe d'accompagnement.</w:t>
         <w:br/>
-        <w:t>• OS II - Directives basées sur des preuves scientifiques : Harmonisation, validation technique et déploiement de 10 POS prioritaires plastifiées.</w:t>
+        <w:t>2. Renforcement de la Formation Pratique : Ajout d'ateliers de démonstration pratique du lavage/friction des mains pour l'ensemble des agents hospitaliers et connexes, valorisation scientifique des données au congrès de la Société Béninoise d'Hygiène Hospitalière (SB2HPCI) et Journée du 5 mai.</w:t>
         <w:br/>
-        <w:t>• OS III - Formation et Éducation en PCI : Formation continue de 500 soignants aux précautions standard/complémentaires, 300 agents au bionettoyage, éducation des usagers et congrès SB2HPCI.</w:t>
+        <w:t>3. Surveillance Hebdomadaire Active : Mise en place d'un recueil hebdomadaire des données d'IAS par les points focaux de service avec analyse et présentation systématique aux réunions de l'EOPCI, en complément des enquêtes de prévalence ciblées et des 33 séries microbiologiques au laboratoire.</w:t>
         <w:br/>
-        <w:t>• OS IV - Gouvernance : 52 réunions hebdomadaires de l'EOPCI et 4 sessions statutaires régulières du CLIN avec suivi des décisions.</w:t>
+        <w:t>4. Suivi Qualité DBM et Traçabilité : Instauration d'un suivi mensuel de la qualité du tri des DBM et supervision étendue de la disponibilité des équipements de lavage des mains, bionettoyage, lingerie et stérilisation.</w:t>
         <w:br/>
-        <w:t>• OS V - Surveillance des IAS et Microbiologie : Protocoles de surveillance, 2 enquêtes de prévalence et 33 séries d'analyses microbiologiques de surveillance environnementale.</w:t>
-        <w:br/>
-        <w:t>• OS VI - Stratégies multimodales de l'OMS : Intégration des 5 composantes de l'OMS, affichage visuel (300 supports plastifiés) et sensibilisation continue.</w:t>
-        <w:br/>
-        <w:t>• OS VII - Suivi, Audits et Restitution : Évaluation mensuelle de l'observance, audits cliniques trimestriels, acquisition de matériels informatiques, célébration du 5 mai et feedback.</w:t>
-        <w:br/>
-        <w:t>• OS VIII - Charges de travail, Déchets Biomédicaux et WASH : Évaluation de l'espacement des lits, fiches de poste, réseau de 24 points focaux, filière DBM (50 poubelles, peson, projet d'incinérateur), contrôle de l'eau et 20 dispositifs de lavage des mains.</w:t>
+        <w:t>5. Axe Stratégique Dédié à la Communication : Structuration complète de l'élaboration, de la multiplication (500 affiches/posters plastifiés) et de la diffusion pérenne des outils de communication visuelle au point de soins.</w:t>
       </w:r>
     </w:p>
     <w:p>
@@ -303,7 +297,7 @@
           <w:color w:val="1B365D"/>
           <w:sz w:val="22"/>
         </w:rPr>
-        <w:t>2. Matrice Opérationnelle Détaillée du Plan de Travail Annuel (PTA) 2026-2027</w:t>
+        <w:t>2. Matrice Opérationnelle Réajustée du Plan de Travail Annuel (PTA) 2026-2027</w:t>
       </w:r>
     </w:p>
     <w:tbl>
@@ -804,7 +798,7 @@
               <w:rPr>
                 <w:sz w:val="16"/>
               </w:rPr>
-              <w:t>1.1.1. Rédiger la note de service portant nomination du Point Focal PCI du CHUMEL</w:t>
+              <w:t>1.1.1. Rédiger le cahier de charges de l'EOPCI</w:t>
             </w:r>
           </w:p>
         </w:tc>
@@ -826,7 +820,7 @@
               <w:rPr>
                 <w:sz w:val="15"/>
               </w:rPr>
-              <w:t>DG / Point focal</w:t>
+              <w:t>Point focal / EOPCI / DG</w:t>
             </w:r>
           </w:p>
         </w:tc>
@@ -867,7 +861,7 @@
               <w:rPr>
                 <w:sz w:val="15"/>
               </w:rPr>
-              <w:t>Note de nomination antérieure caduque</w:t>
+              <w:t>Cahier de charges non formalisé</w:t>
             </w:r>
           </w:p>
         </w:tc>
@@ -886,7 +880,7 @@
               <w:rPr>
                 <w:sz w:val="15"/>
               </w:rPr>
-              <w:t>Note de service officielle signée par le DG et notifiée à tous les services</w:t>
+              <w:t>Cahier de charges de l'EOPCI élaboré, validé et approuvé par la DG</w:t>
             </w:r>
           </w:p>
         </w:tc>
@@ -906,9 +900,10 @@
             </w:pPr>
             <w:r>
               <w:rPr>
+                <w:b/>
                 <w:sz w:val="15"/>
               </w:rPr>
-              <w:t>Néant</w:t>
+              <w:t>FP</w:t>
             </w:r>
           </w:p>
         </w:tc>
@@ -946,7 +941,7 @@
               <w:rPr>
                 <w:sz w:val="16"/>
               </w:rPr>
-              <w:t>1.1.2. Renouveler et formaliser le Comité de Lutte contre les Infections Nosocomiales (CLIN)</w:t>
+              <w:t>1.1.2. Rédiger la note de service portant nomination du Point Focal PCI du CHUMEL ainsi que la fiche des tâches de chaque membre</w:t>
             </w:r>
           </w:p>
         </w:tc>
@@ -968,7 +963,7 @@
               <w:rPr>
                 <w:sz w:val="15"/>
               </w:rPr>
-              <w:t>DG / CLIN</w:t>
+              <w:t>DG / Point focal</w:t>
             </w:r>
           </w:p>
         </w:tc>
@@ -990,7 +985,7 @@
               <w:rPr>
                 <w:sz w:val="15"/>
               </w:rPr>
-              <w:t>Novembre 2026</w:t>
+              <w:t>Octobre 2026</w:t>
             </w:r>
           </w:p>
         </w:tc>
@@ -1009,7 +1004,7 @@
               <w:rPr>
                 <w:sz w:val="15"/>
               </w:rPr>
-              <w:t>Mandat des membres du CLIN arrivé à échéance</w:t>
+              <w:t>Note de nomination antérieure caduque et fiches de tâches inexistantes</w:t>
             </w:r>
           </w:p>
         </w:tc>
@@ -1028,7 +1023,7 @@
               <w:rPr>
                 <w:sz w:val="15"/>
               </w:rPr>
-              <w:t>Décision institutionnelle portant renouvellement des membres du CLIN publiée</w:t>
+              <w:t>Note de service officielle signée par le DG et fiches des tâches notifiées à chaque membre</w:t>
             </w:r>
           </w:p>
         </w:tc>
@@ -1088,7 +1083,7 @@
               <w:rPr>
                 <w:sz w:val="16"/>
               </w:rPr>
-              <w:t>1.1.3. Renouveler et restructurer l’Équipe Opérationnelle de PCI (EOPCI)</w:t>
+              <w:t>1.1.3. Renouveler et formaliser le Comité de Lutte contre les Infections Nosocomiales (CLIN)</w:t>
             </w:r>
           </w:p>
         </w:tc>
@@ -1110,7 +1105,7 @@
               <w:rPr>
                 <w:sz w:val="15"/>
               </w:rPr>
-              <w:t>DG / Point focal</w:t>
+              <w:t>DG / CLIN</w:t>
             </w:r>
           </w:p>
         </w:tc>
@@ -1151,7 +1146,7 @@
               <w:rPr>
                 <w:sz w:val="15"/>
               </w:rPr>
-              <w:t>Composition antérieure de l'EOPCI partielle et informelle</w:t>
+              <w:t>Mandat des membres du CLIN arrivé à échéance</w:t>
             </w:r>
           </w:p>
         </w:tc>
@@ -1170,7 +1165,7 @@
               <w:rPr>
                 <w:sz w:val="15"/>
               </w:rPr>
-              <w:t>Note de service portant composition multidisciplinaire et renouvellement de l’EOPCI</w:t>
+              <w:t>Décision institutionnelle portant renouvellement des membres du CLIN publiée</w:t>
             </w:r>
           </w:p>
         </w:tc>
@@ -1230,15 +1225,7 @@
               <w:rPr>
                 <w:sz w:val="16"/>
               </w:rPr>
-              <w:t>1.1.4. Mettre en place une équipe opérationnelle PCI dédiée à plein temps et définir son cahier des charges :</w:t>
-              <w:br/>
-              <w:t>- Élaborer le projet de cahier des charges de l'EOPCI</w:t>
-              <w:br/>
-              <w:t>- Valider le projet en réunion de direction</w:t>
-              <w:br/>
-              <w:t>- Approuver et signer le cahier des charges par la DG</w:t>
-              <w:br/>
-              <w:t>- Affecter au moins un praticien et un infirmier dédiés à plein temps à la PCI</w:t>
+              <w:t>1.1.4. Renouveler et restructurer l’Équipe Opérationnelle de PCI (EOPCI)</w:t>
             </w:r>
           </w:p>
         </w:tc>
@@ -1260,7 +1247,7 @@
               <w:rPr>
                 <w:sz w:val="15"/>
               </w:rPr>
-              <w:t>DG / DAF / Point focal</w:t>
+              <w:t>DG / Point focal</w:t>
             </w:r>
           </w:p>
         </w:tc>
@@ -1282,7 +1269,7 @@
               <w:rPr>
                 <w:sz w:val="15"/>
               </w:rPr>
-              <w:t>Décembre 2026</w:t>
+              <w:t>Novembre 2026</w:t>
             </w:r>
           </w:p>
         </w:tc>
@@ -1301,7 +1288,7 @@
               <w:rPr>
                 <w:sz w:val="15"/>
               </w:rPr>
-              <w:t>Absence de personnel dédié à plein temps / Cahier des charges absent</w:t>
+              <w:t>Composition antérieure de l'EOPCI partielle et informelle</w:t>
             </w:r>
           </w:p>
         </w:tc>
@@ -1320,7 +1307,7 @@
               <w:rPr>
                 <w:sz w:val="15"/>
               </w:rPr>
-              <w:t>Cahier des charges approuvé et au moins 1 médecin/pharmacien et 1 soignant dédiés à 100% à la PCI</w:t>
+              <w:t>Note de service portant composition multidisciplinaire et renouvellement de l’EOPCI</w:t>
             </w:r>
           </w:p>
         </w:tc>
@@ -1380,7 +1367,7 @@
               <w:rPr>
                 <w:sz w:val="16"/>
               </w:rPr>
-              <w:t>1.1.5. Nommer formellement l’équipe des formateurs internes en PCI du CHUMEL</w:t>
+              <w:t>1.1.5. Nommer l’équipe des formateurs internes en PCI du CHUMEL</w:t>
             </w:r>
           </w:p>
         </w:tc>
@@ -1502,9 +1489,14 @@
         </w:tc>
         <w:tc>
           <w:tcPr>
-            <w:tcW w:type="dxa" w:w="2304"/>
-            <w:vMerge w:val="restart"/>
-            <w:shd w:fill="F2F2F2"/>
+            <w:tcW w:type="dxa" w:w="1888"/>
+            <w:vMerge/>
+          </w:tcPr>
+          <w:p/>
+        </w:tc>
+        <w:tc>
+          <w:tcPr>
+            <w:tcW w:type="dxa" w:w="3888"/>
             <w:tcMar>
               <w:top w:w="60" w:type="dxa"/>
               <w:bottom w:w="60" w:type="dxa"/>
@@ -1515,29 +1507,9 @@
           <w:p>
             <w:r>
               <w:rPr>
-                <w:b/>
-                <w:sz w:val="15"/>
-              </w:rPr>
-              <w:t>1.2. Élaboration, validation, approbation et dissémination du PTA budgétisé</w:t>
-            </w:r>
-          </w:p>
-        </w:tc>
-        <w:tc>
-          <w:tcPr>
-            <w:tcW w:type="dxa" w:w="3888"/>
-            <w:tcMar>
-              <w:top w:w="60" w:type="dxa"/>
-              <w:bottom w:w="60" w:type="dxa"/>
-              <w:left w:w="60" w:type="dxa"/>
-              <w:right w:w="60" w:type="dxa"/>
-            </w:tcMar>
-          </w:tcPr>
-          <w:p>
-            <w:r>
-              <w:rPr>
                 <w:sz w:val="16"/>
               </w:rPr>
-              <w:t>1.2.1. Élaborer le Plan de Travail Annuel (PTA) et le budget prévisionnel PCI/CLIN 2026-2027</w:t>
+              <w:t>1.1.6. Nommer les points focaux IAS-PCI dans les services médico-techniques (binôme soignant et agent d'entretien)</w:t>
             </w:r>
           </w:p>
         </w:tc>
@@ -1559,7 +1531,7 @@
               <w:rPr>
                 <w:sz w:val="15"/>
               </w:rPr>
-              <w:t>Point focal / EOPCI</w:t>
+              <w:t>EOPCI / DG</w:t>
             </w:r>
           </w:p>
         </w:tc>
@@ -1581,7 +1553,7 @@
               <w:rPr>
                 <w:sz w:val="15"/>
               </w:rPr>
-              <w:t>Octobre 2026</w:t>
+              <w:t>Novembre 2026 - Janvier 2027</w:t>
             </w:r>
           </w:p>
         </w:tc>
@@ -1600,7 +1572,7 @@
               <w:rPr>
                 <w:sz w:val="15"/>
               </w:rPr>
-              <w:t>Plan d'action antérieur expiré</w:t>
+              <w:t>Absence de réseau formalisé de relais de terrain</w:t>
             </w:r>
           </w:p>
         </w:tc>
@@ -1619,7 +1591,7 @@
               <w:rPr>
                 <w:sz w:val="15"/>
               </w:rPr>
-              <w:t>Document complet du PTA et budget PCI 2026-2027 finalisé</w:t>
+              <w:t>24 points focaux nommés par note de service, dotés d'une lettre de mission et opérationnels</w:t>
             </w:r>
           </w:p>
         </w:tc>
@@ -1680,7 +1652,7 @@
               <w:rPr>
                 <w:sz w:val="16"/>
               </w:rPr>
-              <w:t>1.2.2. Organiser l'atelier de validation institutionnelle du PTA et du budget PCI/CLIN avec les parties prenantes</w:t>
+              <w:t>1.1.7. Solliciter une expertise externe pour accompagner la PCI</w:t>
             </w:r>
           </w:p>
         </w:tc>
@@ -1702,7 +1674,7 @@
               <w:rPr>
                 <w:sz w:val="15"/>
               </w:rPr>
-              <w:t>DG / CLIN / Point focal</w:t>
+              <w:t>DG / Point focal PCI</w:t>
             </w:r>
           </w:p>
         </w:tc>
@@ -1724,7 +1696,7 @@
               <w:rPr>
                 <w:sz w:val="15"/>
               </w:rPr>
-              <w:t>Novembre 2026</w:t>
+              <w:t>Décembre 2026 - Février 2027</w:t>
             </w:r>
           </w:p>
         </w:tc>
@@ -1743,7 +1715,7 @@
               <w:rPr>
                 <w:sz w:val="15"/>
               </w:rPr>
-              <w:t>Projet de PTA non encore validé</w:t>
+              <w:t>Absence d'accompagnement externe formalisé</w:t>
             </w:r>
           </w:p>
         </w:tc>
@@ -1762,7 +1734,7 @@
               <w:rPr>
                 <w:sz w:val="15"/>
               </w:rPr>
-              <w:t>Rapport d'atelier de validation et document de PTA budgétisé validé par consensus</w:t>
+              <w:t>Expert externe mobilisé (OMS/Ministère/Société savante) et rapport d'appui technique produit</w:t>
             </w:r>
           </w:p>
         </w:tc>
@@ -1785,7 +1757,7 @@
                 <w:b/>
                 <w:sz w:val="15"/>
               </w:rPr>
-              <w:t>FP</w:t>
+              <w:t>FP / PTF</w:t>
             </w:r>
           </w:p>
         </w:tc>
@@ -1803,14 +1775,9 @@
         </w:tc>
         <w:tc>
           <w:tcPr>
-            <w:tcW w:type="dxa" w:w="1888"/>
-            <w:vMerge/>
-          </w:tcPr>
-          <w:p/>
-        </w:tc>
-        <w:tc>
-          <w:tcPr>
-            <w:tcW w:type="dxa" w:w="3888"/>
+            <w:tcW w:type="dxa" w:w="2304"/>
+            <w:vMerge w:val="restart"/>
+            <w:shd w:fill="F2F2F2"/>
             <w:tcMar>
               <w:top w:w="60" w:type="dxa"/>
               <w:bottom w:w="60" w:type="dxa"/>
@@ -1821,9 +1788,29 @@
           <w:p>
             <w:r>
               <w:rPr>
+                <w:b/>
+                <w:sz w:val="15"/>
+              </w:rPr>
+              <w:t>1.2. Renforcement de la structure fonctionnelle de la PCI (gouvernance)</w:t>
+            </w:r>
+          </w:p>
+        </w:tc>
+        <w:tc>
+          <w:tcPr>
+            <w:tcW w:type="dxa" w:w="3888"/>
+            <w:tcMar>
+              <w:top w:w="60" w:type="dxa"/>
+              <w:bottom w:w="60" w:type="dxa"/>
+              <w:left w:w="60" w:type="dxa"/>
+              <w:right w:w="60" w:type="dxa"/>
+            </w:tcMar>
+          </w:tcPr>
+          <w:p>
+            <w:r>
+              <w:rPr>
                 <w:sz w:val="16"/>
               </w:rPr>
-              <w:t>1.2.3. Approuver officiellement le plan élaboré selon les exigences de l'OMS par la Direction Générale</w:t>
+              <w:t>1.2.1. Organiser les réunions hebdomadaires de l’équipe opérationnelle PCI (EOPCI)</w:t>
             </w:r>
           </w:p>
         </w:tc>
@@ -1845,7 +1832,7 @@
               <w:rPr>
                 <w:sz w:val="15"/>
               </w:rPr>
-              <w:t>DG</w:t>
+              <w:t>Point focal / EOPCI</w:t>
             </w:r>
           </w:p>
         </w:tc>
@@ -1867,7 +1854,7 @@
               <w:rPr>
                 <w:sz w:val="15"/>
               </w:rPr>
-              <w:t>Décembre 2026</w:t>
+              <w:t>Hebdomadaire (Oct. 2026 - Sept. 2027)</w:t>
             </w:r>
           </w:p>
         </w:tc>
@@ -1886,7 +1873,7 @@
               <w:rPr>
                 <w:sz w:val="15"/>
               </w:rPr>
-              <w:t>PTA validé en attente d'approbation hiérarchique</w:t>
+              <w:t>Réunions d'équipe irrégulières</w:t>
             </w:r>
           </w:p>
         </w:tc>
@@ -1905,7 +1892,7 @@
               <w:rPr>
                 <w:sz w:val="15"/>
               </w:rPr>
-              <w:t>PTA officiellement revêtu du visa d'approbation de la DG</w:t>
+              <w:t>48 à 52 comptes-rendus de réunion hebdomadaire archivés</w:t>
             </w:r>
           </w:p>
         </w:tc>
@@ -1925,9 +1912,10 @@
             </w:pPr>
             <w:r>
               <w:rPr>
+                <w:b/>
                 <w:sz w:val="15"/>
               </w:rPr>
-              <w:t>Néant</w:t>
+              <w:t>FP / Néant</w:t>
             </w:r>
           </w:p>
         </w:tc>
@@ -1965,11 +1953,13 @@
               <w:rPr>
                 <w:sz w:val="16"/>
               </w:rPr>
-              <w:t>1.2.4. Disséminer et vulgariser le PTA PCI auprès du CLIN et de l'ensemble des départements et services de soins :</w:t>
+              <w:t>1.2.2. Organiser les réunions trimestrielles statutaires du Comité de Lutte contre les Infections Nosocomiales (CLIN) :</w:t>
               <w:br/>
-              <w:t>- Multiplier et relier les exemplaires du PTA approuvé</w:t>
+              <w:t>- Présentation des bilans trimestriels et des tableaux de bord</w:t>
               <w:br/>
-              <w:t>- Transmettre officiellement aux chefs de pôles et surveillants</w:t>
+              <w:t>- Examen des rapports d'audit et de surveillance microbiologique</w:t>
+              <w:br/>
+              <w:t>- Prise de décisions stratégiques et ajustement du plan d'action</w:t>
             </w:r>
           </w:p>
         </w:tc>
@@ -1991,7 +1981,7 @@
               <w:rPr>
                 <w:sz w:val="15"/>
               </w:rPr>
-              <w:t>Point focal / EOPCI</w:t>
+              <w:t>Président CLIN / Point focal / DG</w:t>
             </w:r>
           </w:p>
         </w:tc>
@@ -2013,7 +2003,7 @@
               <w:rPr>
                 <w:sz w:val="15"/>
               </w:rPr>
-              <w:t>Janvier 2027</w:t>
+              <w:t>Trimestriel (Déc. 2026, Mars, Juin, Sept. 2027)</w:t>
             </w:r>
           </w:p>
         </w:tc>
@@ -2032,7 +2022,7 @@
               <w:rPr>
                 <w:sz w:val="15"/>
               </w:rPr>
-              <w:t>PTA non vulgarisé dans les unités de soins</w:t>
+              <w:t>CLIN réuni de façon discontinue (1 à 2 fois par an)</w:t>
             </w:r>
           </w:p>
         </w:tc>
@@ -2051,7 +2041,7 @@
               <w:rPr>
                 <w:sz w:val="15"/>
               </w:rPr>
-              <w:t>Bordereau de transmission et diffusion du PTA dans 100% des services hospitaliers</w:t>
+              <w:t>4 sessions statutaires du CLIN tenues avec procès-verbaux et relevés de décisions</w:t>
             </w:r>
           </w:p>
         </w:tc>
@@ -2112,7 +2102,7 @@
               <w:rPr>
                 <w:sz w:val="16"/>
               </w:rPr>
-              <w:t>1.2.5. Intégrer le PTA et le budget PCI au Plan Intégré de Travail Annuel (PITA 2027) du CHUMEL</w:t>
+              <w:t>1.2.3. Assurer le suivi rapproché de la mise en œuvre des décisions du CLIN et des recommandations d'audit</w:t>
             </w:r>
           </w:p>
         </w:tc>
@@ -2134,7 +2124,7 @@
               <w:rPr>
                 <w:sz w:val="15"/>
               </w:rPr>
-              <w:t>DG / DAF / Point focal</w:t>
+              <w:t>EOPCI / DAF / DG</w:t>
             </w:r>
           </w:p>
         </w:tc>
@@ -2156,7 +2146,7 @@
               <w:rPr>
                 <w:sz w:val="15"/>
               </w:rPr>
-              <w:t>Janvier 2027</w:t>
+              <w:t>Continu</w:t>
             </w:r>
           </w:p>
         </w:tc>
@@ -2175,7 +2165,7 @@
               <w:rPr>
                 <w:sz w:val="15"/>
               </w:rPr>
-              <w:t>Lignes budgétaires PCI non inscrites au budget hospitalier</w:t>
+              <w:t>Faible traçabilité et application des résolutions antérieures</w:t>
             </w:r>
           </w:p>
         </w:tc>
@@ -2194,7 +2184,7 @@
               <w:rPr>
                 <w:sz w:val="15"/>
               </w:rPr>
-              <w:t>Lignes budgétaires et activités PCI inscrites et votées dans le PITA 2027 du CHUMEL</w:t>
+              <w:t>Tableau de bord de mise en œuvre des recommandations actualisé chaque trimestre</w:t>
             </w:r>
           </w:p>
         </w:tc>
@@ -2227,6 +2217,738 @@
         </w:trPr>
         <w:tc>
           <w:tcPr>
+            <w:tcW w:type="dxa" w:w="1888"/>
+            <w:vMerge/>
+          </w:tcPr>
+          <w:p/>
+        </w:tc>
+        <w:tc>
+          <w:tcPr>
+            <w:tcW w:type="dxa" w:w="2304"/>
+            <w:vMerge w:val="restart"/>
+            <w:shd w:fill="F2F2F2"/>
+            <w:tcMar>
+              <w:top w:w="60" w:type="dxa"/>
+              <w:bottom w:w="60" w:type="dxa"/>
+              <w:left w:w="60" w:type="dxa"/>
+              <w:right w:w="60" w:type="dxa"/>
+            </w:tcMar>
+          </w:tcPr>
+          <w:p>
+            <w:r>
+              <w:rPr>
+                <w:b/>
+                <w:sz w:val="15"/>
+              </w:rPr>
+              <w:t>1.3. Élaboration, validation, approbation et dissémination du PTA budgétisé</w:t>
+            </w:r>
+          </w:p>
+        </w:tc>
+        <w:tc>
+          <w:tcPr>
+            <w:tcW w:type="dxa" w:w="3888"/>
+            <w:tcMar>
+              <w:top w:w="60" w:type="dxa"/>
+              <w:bottom w:w="60" w:type="dxa"/>
+              <w:left w:w="60" w:type="dxa"/>
+              <w:right w:w="60" w:type="dxa"/>
+            </w:tcMar>
+          </w:tcPr>
+          <w:p>
+            <w:r>
+              <w:rPr>
+                <w:sz w:val="16"/>
+              </w:rPr>
+              <w:t>1.3.1. Élaborer le Plan de Travail Annuel (PTA) et le budget prévisionnel PCI/CLIN 2026-2027</w:t>
+            </w:r>
+          </w:p>
+        </w:tc>
+        <w:tc>
+          <w:tcPr>
+            <w:tcW w:type="dxa" w:w="1296"/>
+            <w:tcMar>
+              <w:top w:w="60" w:type="dxa"/>
+              <w:bottom w:w="60" w:type="dxa"/>
+              <w:left w:w="40" w:type="dxa"/>
+              <w:right w:w="40" w:type="dxa"/>
+            </w:tcMar>
+          </w:tcPr>
+          <w:p>
+            <w:pPr>
+              <w:jc w:val="center"/>
+            </w:pPr>
+            <w:r>
+              <w:rPr>
+                <w:sz w:val="15"/>
+              </w:rPr>
+              <w:t>Point focal / EOPCI</w:t>
+            </w:r>
+          </w:p>
+        </w:tc>
+        <w:tc>
+          <w:tcPr>
+            <w:tcW w:type="dxa" w:w="1296"/>
+            <w:tcMar>
+              <w:top w:w="60" w:type="dxa"/>
+              <w:bottom w:w="60" w:type="dxa"/>
+              <w:left w:w="40" w:type="dxa"/>
+              <w:right w:w="40" w:type="dxa"/>
+            </w:tcMar>
+          </w:tcPr>
+          <w:p>
+            <w:pPr>
+              <w:jc w:val="center"/>
+            </w:pPr>
+            <w:r>
+              <w:rPr>
+                <w:sz w:val="15"/>
+              </w:rPr>
+              <w:t>Octobre 2026</w:t>
+            </w:r>
+          </w:p>
+        </w:tc>
+        <w:tc>
+          <w:tcPr>
+            <w:tcW w:type="dxa" w:w="2016"/>
+            <w:tcMar>
+              <w:top w:w="60" w:type="dxa"/>
+              <w:bottom w:w="60" w:type="dxa"/>
+              <w:left w:w="60" w:type="dxa"/>
+              <w:right w:w="60" w:type="dxa"/>
+            </w:tcMar>
+          </w:tcPr>
+          <w:p>
+            <w:r>
+              <w:rPr>
+                <w:sz w:val="15"/>
+              </w:rPr>
+              <w:t>Plan d'action antérieur expiré</w:t>
+            </w:r>
+          </w:p>
+        </w:tc>
+        <w:tc>
+          <w:tcPr>
+            <w:tcW w:type="dxa" w:w="2160"/>
+            <w:tcMar>
+              <w:top w:w="60" w:type="dxa"/>
+              <w:bottom w:w="60" w:type="dxa"/>
+              <w:left w:w="60" w:type="dxa"/>
+              <w:right w:w="60" w:type="dxa"/>
+            </w:tcMar>
+          </w:tcPr>
+          <w:p>
+            <w:r>
+              <w:rPr>
+                <w:sz w:val="15"/>
+              </w:rPr>
+              <w:t>Document complet du PTA et budget PCI 2026-2027 finalisé</w:t>
+            </w:r>
+          </w:p>
+        </w:tc>
+        <w:tc>
+          <w:tcPr>
+            <w:tcW w:type="dxa" w:w="1152"/>
+            <w:tcMar>
+              <w:top w:w="60" w:type="dxa"/>
+              <w:bottom w:w="60" w:type="dxa"/>
+              <w:left w:w="40" w:type="dxa"/>
+              <w:right w:w="40" w:type="dxa"/>
+            </w:tcMar>
+          </w:tcPr>
+          <w:p>
+            <w:pPr>
+              <w:jc w:val="center"/>
+            </w:pPr>
+            <w:r>
+              <w:rPr>
+                <w:b/>
+                <w:sz w:val="15"/>
+              </w:rPr>
+              <w:t>FP</w:t>
+            </w:r>
+          </w:p>
+        </w:tc>
+      </w:tr>
+      <w:tr>
+        <w:trPr>
+          <w:cantSplit/>
+        </w:trPr>
+        <w:tc>
+          <w:tcPr>
+            <w:tcW w:type="dxa" w:w="1888"/>
+            <w:vMerge/>
+          </w:tcPr>
+          <w:p/>
+        </w:tc>
+        <w:tc>
+          <w:tcPr>
+            <w:tcW w:type="dxa" w:w="1888"/>
+            <w:vMerge/>
+          </w:tcPr>
+          <w:p/>
+        </w:tc>
+        <w:tc>
+          <w:tcPr>
+            <w:tcW w:type="dxa" w:w="3888"/>
+            <w:tcMar>
+              <w:top w:w="60" w:type="dxa"/>
+              <w:bottom w:w="60" w:type="dxa"/>
+              <w:left w:w="60" w:type="dxa"/>
+              <w:right w:w="60" w:type="dxa"/>
+            </w:tcMar>
+          </w:tcPr>
+          <w:p>
+            <w:r>
+              <w:rPr>
+                <w:sz w:val="16"/>
+              </w:rPr>
+              <w:t>1.3.2. Organiser l'atelier de validation institutionnelle du PTA et du budget PCI/CLIN avec les parties prenantes</w:t>
+            </w:r>
+          </w:p>
+        </w:tc>
+        <w:tc>
+          <w:tcPr>
+            <w:tcW w:type="dxa" w:w="1296"/>
+            <w:tcMar>
+              <w:top w:w="60" w:type="dxa"/>
+              <w:bottom w:w="60" w:type="dxa"/>
+              <w:left w:w="40" w:type="dxa"/>
+              <w:right w:w="40" w:type="dxa"/>
+            </w:tcMar>
+          </w:tcPr>
+          <w:p>
+            <w:pPr>
+              <w:jc w:val="center"/>
+            </w:pPr>
+            <w:r>
+              <w:rPr>
+                <w:sz w:val="15"/>
+              </w:rPr>
+              <w:t>DG / CLIN / Point focal</w:t>
+            </w:r>
+          </w:p>
+        </w:tc>
+        <w:tc>
+          <w:tcPr>
+            <w:tcW w:type="dxa" w:w="1296"/>
+            <w:tcMar>
+              <w:top w:w="60" w:type="dxa"/>
+              <w:bottom w:w="60" w:type="dxa"/>
+              <w:left w:w="40" w:type="dxa"/>
+              <w:right w:w="40" w:type="dxa"/>
+            </w:tcMar>
+          </w:tcPr>
+          <w:p>
+            <w:pPr>
+              <w:jc w:val="center"/>
+            </w:pPr>
+            <w:r>
+              <w:rPr>
+                <w:sz w:val="15"/>
+              </w:rPr>
+              <w:t>Novembre 2026</w:t>
+            </w:r>
+          </w:p>
+        </w:tc>
+        <w:tc>
+          <w:tcPr>
+            <w:tcW w:type="dxa" w:w="2016"/>
+            <w:tcMar>
+              <w:top w:w="60" w:type="dxa"/>
+              <w:bottom w:w="60" w:type="dxa"/>
+              <w:left w:w="60" w:type="dxa"/>
+              <w:right w:w="60" w:type="dxa"/>
+            </w:tcMar>
+          </w:tcPr>
+          <w:p>
+            <w:r>
+              <w:rPr>
+                <w:sz w:val="15"/>
+              </w:rPr>
+              <w:t>Projet de PTA non encore validé</w:t>
+            </w:r>
+          </w:p>
+        </w:tc>
+        <w:tc>
+          <w:tcPr>
+            <w:tcW w:type="dxa" w:w="2160"/>
+            <w:tcMar>
+              <w:top w:w="60" w:type="dxa"/>
+              <w:bottom w:w="60" w:type="dxa"/>
+              <w:left w:w="60" w:type="dxa"/>
+              <w:right w:w="60" w:type="dxa"/>
+            </w:tcMar>
+          </w:tcPr>
+          <w:p>
+            <w:r>
+              <w:rPr>
+                <w:sz w:val="15"/>
+              </w:rPr>
+              <w:t>Rapport d'atelier de validation et document de PTA budgétisé validé par consensus</w:t>
+            </w:r>
+          </w:p>
+        </w:tc>
+        <w:tc>
+          <w:tcPr>
+            <w:tcW w:type="dxa" w:w="1152"/>
+            <w:tcMar>
+              <w:top w:w="60" w:type="dxa"/>
+              <w:bottom w:w="60" w:type="dxa"/>
+              <w:left w:w="40" w:type="dxa"/>
+              <w:right w:w="40" w:type="dxa"/>
+            </w:tcMar>
+          </w:tcPr>
+          <w:p>
+            <w:pPr>
+              <w:jc w:val="center"/>
+            </w:pPr>
+            <w:r>
+              <w:rPr>
+                <w:b/>
+                <w:sz w:val="15"/>
+              </w:rPr>
+              <w:t>FP</w:t>
+            </w:r>
+          </w:p>
+        </w:tc>
+      </w:tr>
+      <w:tr>
+        <w:trPr>
+          <w:cantSplit/>
+        </w:trPr>
+        <w:tc>
+          <w:tcPr>
+            <w:tcW w:type="dxa" w:w="1888"/>
+            <w:vMerge/>
+          </w:tcPr>
+          <w:p/>
+        </w:tc>
+        <w:tc>
+          <w:tcPr>
+            <w:tcW w:type="dxa" w:w="1888"/>
+            <w:vMerge/>
+          </w:tcPr>
+          <w:p/>
+        </w:tc>
+        <w:tc>
+          <w:tcPr>
+            <w:tcW w:type="dxa" w:w="3888"/>
+            <w:tcMar>
+              <w:top w:w="60" w:type="dxa"/>
+              <w:bottom w:w="60" w:type="dxa"/>
+              <w:left w:w="60" w:type="dxa"/>
+              <w:right w:w="60" w:type="dxa"/>
+            </w:tcMar>
+          </w:tcPr>
+          <w:p>
+            <w:r>
+              <w:rPr>
+                <w:sz w:val="16"/>
+              </w:rPr>
+              <w:t>1.3.3. Approuver officiellement le plan élaboré selon les exigences de l'OMS par la Direction Générale</w:t>
+            </w:r>
+          </w:p>
+        </w:tc>
+        <w:tc>
+          <w:tcPr>
+            <w:tcW w:type="dxa" w:w="1296"/>
+            <w:tcMar>
+              <w:top w:w="60" w:type="dxa"/>
+              <w:bottom w:w="60" w:type="dxa"/>
+              <w:left w:w="40" w:type="dxa"/>
+              <w:right w:w="40" w:type="dxa"/>
+            </w:tcMar>
+          </w:tcPr>
+          <w:p>
+            <w:pPr>
+              <w:jc w:val="center"/>
+            </w:pPr>
+            <w:r>
+              <w:rPr>
+                <w:sz w:val="15"/>
+              </w:rPr>
+              <w:t>DG</w:t>
+            </w:r>
+          </w:p>
+        </w:tc>
+        <w:tc>
+          <w:tcPr>
+            <w:tcW w:type="dxa" w:w="1296"/>
+            <w:tcMar>
+              <w:top w:w="60" w:type="dxa"/>
+              <w:bottom w:w="60" w:type="dxa"/>
+              <w:left w:w="40" w:type="dxa"/>
+              <w:right w:w="40" w:type="dxa"/>
+            </w:tcMar>
+          </w:tcPr>
+          <w:p>
+            <w:pPr>
+              <w:jc w:val="center"/>
+            </w:pPr>
+            <w:r>
+              <w:rPr>
+                <w:sz w:val="15"/>
+              </w:rPr>
+              <w:t>Décembre 2026</w:t>
+            </w:r>
+          </w:p>
+        </w:tc>
+        <w:tc>
+          <w:tcPr>
+            <w:tcW w:type="dxa" w:w="2016"/>
+            <w:tcMar>
+              <w:top w:w="60" w:type="dxa"/>
+              <w:bottom w:w="60" w:type="dxa"/>
+              <w:left w:w="60" w:type="dxa"/>
+              <w:right w:w="60" w:type="dxa"/>
+            </w:tcMar>
+          </w:tcPr>
+          <w:p>
+            <w:r>
+              <w:rPr>
+                <w:sz w:val="15"/>
+              </w:rPr>
+              <w:t>PTA validé en attente d'approbation hiérarchique</w:t>
+            </w:r>
+          </w:p>
+        </w:tc>
+        <w:tc>
+          <w:tcPr>
+            <w:tcW w:type="dxa" w:w="2160"/>
+            <w:tcMar>
+              <w:top w:w="60" w:type="dxa"/>
+              <w:bottom w:w="60" w:type="dxa"/>
+              <w:left w:w="60" w:type="dxa"/>
+              <w:right w:w="60" w:type="dxa"/>
+            </w:tcMar>
+          </w:tcPr>
+          <w:p>
+            <w:r>
+              <w:rPr>
+                <w:sz w:val="15"/>
+              </w:rPr>
+              <w:t>PTA officiellement revêtu du visa d'approbation de la DG</w:t>
+            </w:r>
+          </w:p>
+        </w:tc>
+        <w:tc>
+          <w:tcPr>
+            <w:tcW w:type="dxa" w:w="1152"/>
+            <w:tcMar>
+              <w:top w:w="60" w:type="dxa"/>
+              <w:bottom w:w="60" w:type="dxa"/>
+              <w:left w:w="40" w:type="dxa"/>
+              <w:right w:w="40" w:type="dxa"/>
+            </w:tcMar>
+          </w:tcPr>
+          <w:p>
+            <w:pPr>
+              <w:jc w:val="center"/>
+            </w:pPr>
+            <w:r>
+              <w:rPr>
+                <w:sz w:val="15"/>
+              </w:rPr>
+              <w:t>Néant</w:t>
+            </w:r>
+          </w:p>
+        </w:tc>
+      </w:tr>
+      <w:tr>
+        <w:trPr>
+          <w:cantSplit/>
+        </w:trPr>
+        <w:tc>
+          <w:tcPr>
+            <w:tcW w:type="dxa" w:w="1888"/>
+            <w:vMerge/>
+          </w:tcPr>
+          <w:p/>
+        </w:tc>
+        <w:tc>
+          <w:tcPr>
+            <w:tcW w:type="dxa" w:w="1888"/>
+            <w:vMerge/>
+          </w:tcPr>
+          <w:p/>
+        </w:tc>
+        <w:tc>
+          <w:tcPr>
+            <w:tcW w:type="dxa" w:w="3888"/>
+            <w:tcMar>
+              <w:top w:w="60" w:type="dxa"/>
+              <w:bottom w:w="60" w:type="dxa"/>
+              <w:left w:w="60" w:type="dxa"/>
+              <w:right w:w="60" w:type="dxa"/>
+            </w:tcMar>
+          </w:tcPr>
+          <w:p>
+            <w:r>
+              <w:rPr>
+                <w:sz w:val="16"/>
+              </w:rPr>
+              <w:t>1.3.4. Disséminer et vulgariser le PTA PCI auprès de l'ensemble des départements et services de soins :</w:t>
+              <w:br/>
+              <w:t>- Multiplier et relier les exemplaires du PTA approuvé</w:t>
+              <w:br/>
+              <w:t>- Transmettre officiellement aux chefs de pôles et surveillants</w:t>
+            </w:r>
+          </w:p>
+        </w:tc>
+        <w:tc>
+          <w:tcPr>
+            <w:tcW w:type="dxa" w:w="1296"/>
+            <w:tcMar>
+              <w:top w:w="60" w:type="dxa"/>
+              <w:bottom w:w="60" w:type="dxa"/>
+              <w:left w:w="40" w:type="dxa"/>
+              <w:right w:w="40" w:type="dxa"/>
+            </w:tcMar>
+          </w:tcPr>
+          <w:p>
+            <w:pPr>
+              <w:jc w:val="center"/>
+            </w:pPr>
+            <w:r>
+              <w:rPr>
+                <w:sz w:val="15"/>
+              </w:rPr>
+              <w:t>Point focal / EOPCI</w:t>
+            </w:r>
+          </w:p>
+        </w:tc>
+        <w:tc>
+          <w:tcPr>
+            <w:tcW w:type="dxa" w:w="1296"/>
+            <w:tcMar>
+              <w:top w:w="60" w:type="dxa"/>
+              <w:bottom w:w="60" w:type="dxa"/>
+              <w:left w:w="40" w:type="dxa"/>
+              <w:right w:w="40" w:type="dxa"/>
+            </w:tcMar>
+          </w:tcPr>
+          <w:p>
+            <w:pPr>
+              <w:jc w:val="center"/>
+            </w:pPr>
+            <w:r>
+              <w:rPr>
+                <w:sz w:val="15"/>
+              </w:rPr>
+              <w:t>Janvier 2027</w:t>
+            </w:r>
+          </w:p>
+        </w:tc>
+        <w:tc>
+          <w:tcPr>
+            <w:tcW w:type="dxa" w:w="2016"/>
+            <w:tcMar>
+              <w:top w:w="60" w:type="dxa"/>
+              <w:bottom w:w="60" w:type="dxa"/>
+              <w:left w:w="60" w:type="dxa"/>
+              <w:right w:w="60" w:type="dxa"/>
+            </w:tcMar>
+          </w:tcPr>
+          <w:p>
+            <w:r>
+              <w:rPr>
+                <w:sz w:val="15"/>
+              </w:rPr>
+              <w:t>PTA non vulgarisé dans les unités de soins</w:t>
+            </w:r>
+          </w:p>
+        </w:tc>
+        <w:tc>
+          <w:tcPr>
+            <w:tcW w:type="dxa" w:w="2160"/>
+            <w:tcMar>
+              <w:top w:w="60" w:type="dxa"/>
+              <w:bottom w:w="60" w:type="dxa"/>
+              <w:left w:w="60" w:type="dxa"/>
+              <w:right w:w="60" w:type="dxa"/>
+            </w:tcMar>
+          </w:tcPr>
+          <w:p>
+            <w:r>
+              <w:rPr>
+                <w:sz w:val="15"/>
+              </w:rPr>
+              <w:t>Bordereau de transmission et diffusion du PTA dans 100% des services hospitaliers</w:t>
+            </w:r>
+          </w:p>
+        </w:tc>
+        <w:tc>
+          <w:tcPr>
+            <w:tcW w:type="dxa" w:w="1152"/>
+            <w:tcMar>
+              <w:top w:w="60" w:type="dxa"/>
+              <w:bottom w:w="60" w:type="dxa"/>
+              <w:left w:w="40" w:type="dxa"/>
+              <w:right w:w="40" w:type="dxa"/>
+            </w:tcMar>
+          </w:tcPr>
+          <w:p>
+            <w:pPr>
+              <w:jc w:val="center"/>
+            </w:pPr>
+            <w:r>
+              <w:rPr>
+                <w:b/>
+                <w:sz w:val="15"/>
+              </w:rPr>
+              <w:t>FP</w:t>
+            </w:r>
+          </w:p>
+        </w:tc>
+      </w:tr>
+      <w:tr>
+        <w:trPr>
+          <w:cantSplit/>
+        </w:trPr>
+        <w:tc>
+          <w:tcPr>
+            <w:tcW w:type="dxa" w:w="1888"/>
+            <w:vMerge/>
+          </w:tcPr>
+          <w:p/>
+        </w:tc>
+        <w:tc>
+          <w:tcPr>
+            <w:tcW w:type="dxa" w:w="1888"/>
+            <w:vMerge/>
+          </w:tcPr>
+          <w:p/>
+        </w:tc>
+        <w:tc>
+          <w:tcPr>
+            <w:tcW w:type="dxa" w:w="3888"/>
+            <w:tcMar>
+              <w:top w:w="60" w:type="dxa"/>
+              <w:bottom w:w="60" w:type="dxa"/>
+              <w:left w:w="60" w:type="dxa"/>
+              <w:right w:w="60" w:type="dxa"/>
+            </w:tcMar>
+          </w:tcPr>
+          <w:p>
+            <w:r>
+              <w:rPr>
+                <w:sz w:val="16"/>
+              </w:rPr>
+              <w:t>1.3.5. Intégrer le PTA et le budget PCI au Plan Intégré de Travail Annuel (PITA 2027) du CHUMEL</w:t>
+            </w:r>
+          </w:p>
+        </w:tc>
+        <w:tc>
+          <w:tcPr>
+            <w:tcW w:type="dxa" w:w="1296"/>
+            <w:tcMar>
+              <w:top w:w="60" w:type="dxa"/>
+              <w:bottom w:w="60" w:type="dxa"/>
+              <w:left w:w="40" w:type="dxa"/>
+              <w:right w:w="40" w:type="dxa"/>
+            </w:tcMar>
+          </w:tcPr>
+          <w:p>
+            <w:pPr>
+              <w:jc w:val="center"/>
+            </w:pPr>
+            <w:r>
+              <w:rPr>
+                <w:sz w:val="15"/>
+              </w:rPr>
+              <w:t>DG / DAF / Point focal</w:t>
+            </w:r>
+          </w:p>
+        </w:tc>
+        <w:tc>
+          <w:tcPr>
+            <w:tcW w:type="dxa" w:w="1296"/>
+            <w:tcMar>
+              <w:top w:w="60" w:type="dxa"/>
+              <w:bottom w:w="60" w:type="dxa"/>
+              <w:left w:w="40" w:type="dxa"/>
+              <w:right w:w="40" w:type="dxa"/>
+            </w:tcMar>
+          </w:tcPr>
+          <w:p>
+            <w:pPr>
+              <w:jc w:val="center"/>
+            </w:pPr>
+            <w:r>
+              <w:rPr>
+                <w:sz w:val="15"/>
+              </w:rPr>
+              <w:t>Janvier 2027</w:t>
+            </w:r>
+          </w:p>
+        </w:tc>
+        <w:tc>
+          <w:tcPr>
+            <w:tcW w:type="dxa" w:w="2016"/>
+            <w:tcMar>
+              <w:top w:w="60" w:type="dxa"/>
+              <w:bottom w:w="60" w:type="dxa"/>
+              <w:left w:w="60" w:type="dxa"/>
+              <w:right w:w="60" w:type="dxa"/>
+            </w:tcMar>
+          </w:tcPr>
+          <w:p>
+            <w:r>
+              <w:rPr>
+                <w:sz w:val="15"/>
+              </w:rPr>
+              <w:t>Lignes budgétaires PCI non inscrites au budget hospitalier</w:t>
+            </w:r>
+          </w:p>
+        </w:tc>
+        <w:tc>
+          <w:tcPr>
+            <w:tcW w:type="dxa" w:w="2160"/>
+            <w:tcMar>
+              <w:top w:w="60" w:type="dxa"/>
+              <w:bottom w:w="60" w:type="dxa"/>
+              <w:left w:w="60" w:type="dxa"/>
+              <w:right w:w="60" w:type="dxa"/>
+            </w:tcMar>
+          </w:tcPr>
+          <w:p>
+            <w:r>
+              <w:rPr>
+                <w:sz w:val="15"/>
+              </w:rPr>
+              <w:t>Lignes budgétaires et activités PCI inscrites et votées dans le PITA 2027 du CHUMEL</w:t>
+            </w:r>
+          </w:p>
+        </w:tc>
+        <w:tc>
+          <w:tcPr>
+            <w:tcW w:type="dxa" w:w="1152"/>
+            <w:tcMar>
+              <w:top w:w="60" w:type="dxa"/>
+              <w:bottom w:w="60" w:type="dxa"/>
+              <w:left w:w="40" w:type="dxa"/>
+              <w:right w:w="40" w:type="dxa"/>
+            </w:tcMar>
+          </w:tcPr>
+          <w:p>
+            <w:pPr>
+              <w:jc w:val="center"/>
+            </w:pPr>
+            <w:r>
+              <w:rPr>
+                <w:sz w:val="15"/>
+              </w:rPr>
+              <w:t>Néant</w:t>
+            </w:r>
+          </w:p>
+        </w:tc>
+      </w:tr>
+      <w:tr>
+        <w:trPr>
+          <w:cantSplit/>
+        </w:trPr>
+        <w:tc>
+          <w:tcPr>
             <w:tcW w:type="dxa" w:w="1872"/>
             <w:vMerge w:val="restart"/>
             <w:shd w:fill="D9E1F2"/>
@@ -2244,7 +2966,7 @@
                 <w:color w:val="1B365D"/>
                 <w:sz w:val="17"/>
               </w:rPr>
-              <w:t>II. DIRECTIVES BASÉES SUR DES PREUVES SCIENTIFIQUES</w:t>
+              <w:t>II. LIGNES DIRECTIVES</w:t>
             </w:r>
           </w:p>
         </w:tc>
@@ -2585,7 +3307,7 @@
               <w:rPr>
                 <w:sz w:val="16"/>
               </w:rPr>
-              <w:t>2.1.3. Organiser une séance statutaire de validation technique des POS élaborées par le CLIN</w:t>
+              <w:t>2.1.3. Organiser une séance statutaire de validation technique des POS élaborées par le CLIN et la direction</w:t>
             </w:r>
           </w:p>
         </w:tc>
@@ -3464,6 +4186,149 @@
         </w:tc>
         <w:tc>
           <w:tcPr>
+            <w:tcW w:type="dxa" w:w="1888"/>
+            <w:vMerge/>
+          </w:tcPr>
+          <w:p/>
+        </w:tc>
+        <w:tc>
+          <w:tcPr>
+            <w:tcW w:type="dxa" w:w="3888"/>
+            <w:tcMar>
+              <w:top w:w="60" w:type="dxa"/>
+              <w:bottom w:w="60" w:type="dxa"/>
+              <w:left w:w="60" w:type="dxa"/>
+              <w:right w:w="60" w:type="dxa"/>
+            </w:tcMar>
+          </w:tcPr>
+          <w:p>
+            <w:r>
+              <w:rPr>
+                <w:sz w:val="16"/>
+              </w:rPr>
+              <w:t>3.1.4. Organiser les sessions sur les techniques de lavage des mains au personnel des services hospitaliers et connexes / Sensibilisation des agents sur les techniques de lavage des mains</w:t>
+            </w:r>
+          </w:p>
+        </w:tc>
+        <w:tc>
+          <w:tcPr>
+            <w:tcW w:type="dxa" w:w="1296"/>
+            <w:tcMar>
+              <w:top w:w="60" w:type="dxa"/>
+              <w:bottom w:w="60" w:type="dxa"/>
+              <w:left w:w="40" w:type="dxa"/>
+              <w:right w:w="40" w:type="dxa"/>
+            </w:tcMar>
+          </w:tcPr>
+          <w:p>
+            <w:pPr>
+              <w:jc w:val="center"/>
+            </w:pPr>
+            <w:r>
+              <w:rPr>
+                <w:sz w:val="15"/>
+              </w:rPr>
+              <w:t>Formateurs internes / EOPCI / Points focaux</w:t>
+            </w:r>
+          </w:p>
+        </w:tc>
+        <w:tc>
+          <w:tcPr>
+            <w:tcW w:type="dxa" w:w="1296"/>
+            <w:tcMar>
+              <w:top w:w="60" w:type="dxa"/>
+              <w:bottom w:w="60" w:type="dxa"/>
+              <w:left w:w="40" w:type="dxa"/>
+              <w:right w:w="40" w:type="dxa"/>
+            </w:tcMar>
+          </w:tcPr>
+          <w:p>
+            <w:pPr>
+              <w:jc w:val="center"/>
+            </w:pPr>
+            <w:r>
+              <w:rPr>
+                <w:sz w:val="15"/>
+              </w:rPr>
+              <w:t>Trimestriel (Continu)</w:t>
+            </w:r>
+          </w:p>
+        </w:tc>
+        <w:tc>
+          <w:tcPr>
+            <w:tcW w:type="dxa" w:w="2016"/>
+            <w:tcMar>
+              <w:top w:w="60" w:type="dxa"/>
+              <w:bottom w:w="60" w:type="dxa"/>
+              <w:left w:w="60" w:type="dxa"/>
+              <w:right w:w="60" w:type="dxa"/>
+            </w:tcMar>
+          </w:tcPr>
+          <w:p>
+            <w:r>
+              <w:rPr>
+                <w:sz w:val="15"/>
+              </w:rPr>
+              <w:t>Maîtrise inégale des étapes de friction et lavage des mains</w:t>
+            </w:r>
+          </w:p>
+        </w:tc>
+        <w:tc>
+          <w:tcPr>
+            <w:tcW w:type="dxa" w:w="2160"/>
+            <w:tcMar>
+              <w:top w:w="60" w:type="dxa"/>
+              <w:bottom w:w="60" w:type="dxa"/>
+              <w:left w:w="60" w:type="dxa"/>
+              <w:right w:w="60" w:type="dxa"/>
+            </w:tcMar>
+          </w:tcPr>
+          <w:p>
+            <w:r>
+              <w:rPr>
+                <w:sz w:val="15"/>
+              </w:rPr>
+              <w:t>100% des services hospitaliers et médico-techniques touchés par des ateliers de démonstration pratique (&gt; 600 agents)</w:t>
+            </w:r>
+          </w:p>
+        </w:tc>
+        <w:tc>
+          <w:tcPr>
+            <w:tcW w:type="dxa" w:w="1152"/>
+            <w:tcMar>
+              <w:top w:w="60" w:type="dxa"/>
+              <w:bottom w:w="60" w:type="dxa"/>
+              <w:left w:w="40" w:type="dxa"/>
+              <w:right w:w="40" w:type="dxa"/>
+            </w:tcMar>
+          </w:tcPr>
+          <w:p>
+            <w:pPr>
+              <w:jc w:val="center"/>
+            </w:pPr>
+            <w:r>
+              <w:rPr>
+                <w:b/>
+                <w:sz w:val="15"/>
+              </w:rPr>
+              <w:t>FP</w:t>
+            </w:r>
+          </w:p>
+        </w:tc>
+      </w:tr>
+      <w:tr>
+        <w:trPr>
+          <w:cantSplit/>
+        </w:trPr>
+        <w:tc>
+          <w:tcPr>
+            <w:tcW w:type="dxa" w:w="1888"/>
+            <w:vMerge/>
+          </w:tcPr>
+          <w:p/>
+        </w:tc>
+        <w:tc>
+          <w:tcPr>
             <w:tcW w:type="dxa" w:w="2304"/>
             <w:shd w:fill="F2F2F2"/>
             <w:tcMar>
@@ -3479,7 +4344,7 @@
                 <w:b/>
                 <w:sz w:val="15"/>
               </w:rPr>
-              <w:t>3.2. Formation pratique des agents d'entretien et aides-soignants sur le bionettoyage</w:t>
+              <w:t>3.2. Formation pratique des agents d'entretien et aides-soignants sur le bionettoyage et la gestion des déchets biomédicaux</w:t>
             </w:r>
           </w:p>
         </w:tc>
@@ -3498,7 +4363,7 @@
               <w:rPr>
                 <w:sz w:val="16"/>
               </w:rPr>
-              <w:t>3.2.1. Organiser des sessions pratiques de formation des agents d’entretien et aides-soignants sur le bionettoyage hospitalier :</w:t>
+              <w:t>3.2.1. Organiser des sessions pratiques de formation des agents d’entretien et aides-soignants sur le bionettoyage et la gestion des déchets hospitaliers :</w:t>
               <w:br/>
               <w:t>- Techniques de bionettoyage (du plus propre vers le plus sale)</w:t>
               <w:br/>
@@ -3628,7 +4493,6 @@
         <w:tc>
           <w:tcPr>
             <w:tcW w:type="dxa" w:w="2304"/>
-            <w:vMerge w:val="restart"/>
             <w:shd w:fill="F2F2F2"/>
             <w:tcMar>
               <w:top w:w="60" w:type="dxa"/>
@@ -3643,7 +4507,7 @@
                 <w:b/>
                 <w:sz w:val="15"/>
               </w:rPr>
-              <w:t>3.3. Éducation sanitaire des usagers et participation aux congrès scientifiques</w:t>
+              <w:t>3.3. Éducation sanitaire des usagers</w:t>
             </w:r>
           </w:p>
         </w:tc>
@@ -3789,14 +4653,9 @@
         </w:tc>
         <w:tc>
           <w:tcPr>
-            <w:tcW w:type="dxa" w:w="1888"/>
-            <w:vMerge/>
-          </w:tcPr>
-          <w:p/>
-        </w:tc>
-        <w:tc>
-          <w:tcPr>
-            <w:tcW w:type="dxa" w:w="3888"/>
+            <w:tcW w:type="dxa" w:w="2304"/>
+            <w:vMerge w:val="restart"/>
+            <w:shd w:fill="F2F2F2"/>
             <w:tcMar>
               <w:top w:w="60" w:type="dxa"/>
               <w:bottom w:w="60" w:type="dxa"/>
@@ -3807,9 +4666,29 @@
           <w:p>
             <w:r>
               <w:rPr>
+                <w:b/>
+                <w:sz w:val="15"/>
+              </w:rPr>
+              <w:t>3.4. Participation aux congrès scientifiques et Journée Mondiale</w:t>
+            </w:r>
+          </w:p>
+        </w:tc>
+        <w:tc>
+          <w:tcPr>
+            <w:tcW w:type="dxa" w:w="3888"/>
+            <w:tcMar>
+              <w:top w:w="60" w:type="dxa"/>
+              <w:bottom w:w="60" w:type="dxa"/>
+              <w:left w:w="60" w:type="dxa"/>
+              <w:right w:w="60" w:type="dxa"/>
+            </w:tcMar>
+          </w:tcPr>
+          <w:p>
+            <w:r>
+              <w:rPr>
                 <w:sz w:val="16"/>
               </w:rPr>
-              <w:t>3.3.2. Assurer la participation de la délégation du CHUMEL aux congrès scientifiques de PCI (SB2HPCI / HBEEPTI) (15 membres ciblés)</w:t>
+              <w:t>3.4.1. Assurer la participation de la délégation du CHUMEL aux congrès scientifiques de PCI (SB2HPCI / HBEEPTI) (15 membres ciblés)</w:t>
             </w:r>
           </w:p>
         </w:tc>
@@ -3925,9 +4804,21 @@
         </w:trPr>
         <w:tc>
           <w:tcPr>
-            <w:tcW w:type="dxa" w:w="1872"/>
-            <w:vMerge w:val="restart"/>
-            <w:shd w:fill="D9E1F2"/>
+            <w:tcW w:type="dxa" w:w="1888"/>
+            <w:vMerge/>
+          </w:tcPr>
+          <w:p/>
+        </w:tc>
+        <w:tc>
+          <w:tcPr>
+            <w:tcW w:type="dxa" w:w="1888"/>
+            <w:vMerge/>
+          </w:tcPr>
+          <w:p/>
+        </w:tc>
+        <w:tc>
+          <w:tcPr>
+            <w:tcW w:type="dxa" w:w="3888"/>
             <w:tcMar>
               <w:top w:w="60" w:type="dxa"/>
               <w:bottom w:w="60" w:type="dxa"/>
@@ -3938,56 +4829,9 @@
           <w:p>
             <w:r>
               <w:rPr>
-                <w:b/>
-                <w:color w:val="1B365D"/>
-                <w:sz w:val="17"/>
-              </w:rPr>
-              <w:t>IV. GOUVERNANCE</w:t>
-            </w:r>
-          </w:p>
-        </w:tc>
-        <w:tc>
-          <w:tcPr>
-            <w:tcW w:type="dxa" w:w="2304"/>
-            <w:vMerge w:val="restart"/>
-            <w:shd w:fill="F2F2F2"/>
-            <w:tcMar>
-              <w:top w:w="60" w:type="dxa"/>
-              <w:bottom w:w="60" w:type="dxa"/>
-              <w:left w:w="60" w:type="dxa"/>
-              <w:right w:w="60" w:type="dxa"/>
-            </w:tcMar>
-          </w:tcPr>
-          <w:p>
-            <w:r>
-              <w:rPr>
-                <w:b/>
-                <w:sz w:val="15"/>
-              </w:rPr>
-              <w:t>4.1. Animation des instances de coordination et de pilotage stratégique</w:t>
-            </w:r>
-          </w:p>
-        </w:tc>
-        <w:tc>
-          <w:tcPr>
-            <w:tcW w:type="dxa" w:w="3888"/>
-            <w:tcMar>
-              <w:top w:w="60" w:type="dxa"/>
-              <w:bottom w:w="60" w:type="dxa"/>
-              <w:left w:w="60" w:type="dxa"/>
-              <w:right w:w="60" w:type="dxa"/>
-            </w:tcMar>
-          </w:tcPr>
-          <w:p>
-            <w:r>
-              <w:rPr>
                 <w:sz w:val="16"/>
               </w:rPr>
-              <w:t>4.1.1. Organiser les réunions hebdomadaires de l’équipe opérationnelle PCI (EOPCI) :</w:t>
-              <w:br/>
-              <w:t>- Analyser les alertes infectieuses et incidents de la semaine</w:t>
-              <w:br/>
-              <w:t>- Coordonner les activités de terrain et les supervisions</w:t>
+              <w:t>3.4.2. Participer au congrès de la Société Béninoise d’Hygiène Hospitalière EOPCI (présentation de travaux scientifiques et posters)</w:t>
             </w:r>
           </w:p>
         </w:tc>
@@ -4009,7 +4853,7 @@
               <w:rPr>
                 <w:sz w:val="15"/>
               </w:rPr>
-              <w:t>Point focal / EOPCI</w:t>
+              <w:t>DG / EOPCI / Membres délégués</w:t>
             </w:r>
           </w:p>
         </w:tc>
@@ -4031,7 +4875,7 @@
               <w:rPr>
                 <w:sz w:val="15"/>
               </w:rPr>
-              <w:t>Hebdomadaire (Oct. 2026 - Sept. 2027)</w:t>
+              <w:t>Mai - Juin 2027</w:t>
             </w:r>
           </w:p>
         </w:tc>
@@ -4050,7 +4894,7 @@
               <w:rPr>
                 <w:sz w:val="15"/>
               </w:rPr>
-              <w:t>Réunions d'équipe irrégulières</w:t>
+              <w:t>Faible valorisation des données scientifiques internes</w:t>
             </w:r>
           </w:p>
         </w:tc>
@@ -4069,7 +4913,7 @@
               <w:rPr>
                 <w:sz w:val="15"/>
               </w:rPr>
-              <w:t>48 à 52 comptes-rendus de réunion hebdomadaire archivés</w:t>
+              <w:t>5 communications scientifiques ou posters présentés par le CHUMEL et rapport de congrès validé</w:t>
             </w:r>
           </w:p>
         </w:tc>
@@ -4092,7 +4936,7 @@
                 <w:b/>
                 <w:sz w:val="15"/>
               </w:rPr>
-              <w:t>FP / Néant</w:t>
+              <w:t>FP</w:t>
             </w:r>
           </w:p>
         </w:tc>
@@ -4130,13 +4974,15 @@
               <w:rPr>
                 <w:sz w:val="16"/>
               </w:rPr>
-              <w:t>4.1.2. Organiser les réunions trimestrielles statutaires du Comité de Lutte contre les Infections Nosocomiales (CLIN) :</w:t>
+              <w:t>3.4.3. Faire une journée de l’hygiène des mains (organisation et célébration de la Journée internationale du 5 mai 2027 « Sauvez des vies : nettoyez-vous les mains ») :</w:t>
               <w:br/>
-              <w:t>- Présentation des bilans trimestriels et des tableaux de bord</w:t>
+              <w:t>- Conférences thématiques et ateliers de démonstration pratique</w:t>
               <w:br/>
-              <w:t>- Examen des rapports d'audit et de surveillance microbiologique</w:t>
+              <w:t>- Concours d'émulation du service le plus observant avec remise de prix</w:t>
               <w:br/>
-              <w:t>- Prise de décisions stratégiques et ajustement du plan d'action</w:t>
+              <w:t>- Distribution de flacons individuels de solution hydro-alcoolique (PHA)</w:t>
+              <w:br/>
+              <w:t>- Stands d'information grand public et couverture médiatique</w:t>
             </w:r>
           </w:p>
         </w:tc>
@@ -4158,7 +5004,7 @@
               <w:rPr>
                 <w:sz w:val="15"/>
               </w:rPr>
-              <w:t>Président CLIN / Point focal / DG</w:t>
+              <w:t>CLIN / EOPCI / DG</w:t>
             </w:r>
           </w:p>
         </w:tc>
@@ -4180,7 +5026,7 @@
               <w:rPr>
                 <w:sz w:val="15"/>
               </w:rPr>
-              <w:t>Trimestriel (Déc. 2026, Mars, Juin, Sept. 2027)</w:t>
+              <w:t>Mai 2027</w:t>
             </w:r>
           </w:p>
         </w:tc>
@@ -4199,7 +5045,7 @@
               <w:rPr>
                 <w:sz w:val="15"/>
               </w:rPr>
-              <w:t>CLIN réuni de façon discontinue (1 à 2 fois par an)</w:t>
+              <w:t>Célébration ponctuelle à faible impact</w:t>
             </w:r>
           </w:p>
         </w:tc>
@@ -4218,7 +5064,7 @@
               <w:rPr>
                 <w:sz w:val="15"/>
               </w:rPr>
-              <w:t>4 sessions statutaires du CLIN tenues avec procès-verbaux et relevés de décisions</w:t>
+              <w:t>Journée célébrée avec succès, mobilisation de plus de 500 professionnels, usagers et étudiants primés</w:t>
             </w:r>
           </w:p>
         </w:tc>
@@ -4241,7 +5087,7 @@
                 <w:b/>
                 <w:sz w:val="15"/>
               </w:rPr>
-              <w:t>FP</w:t>
+              <w:t>FP / PTF</w:t>
             </w:r>
           </w:p>
         </w:tc>
@@ -4252,21 +5098,9 @@
         </w:trPr>
         <w:tc>
           <w:tcPr>
-            <w:tcW w:type="dxa" w:w="1888"/>
-            <w:vMerge/>
-          </w:tcPr>
-          <w:p/>
-        </w:tc>
-        <w:tc>
-          <w:tcPr>
-            <w:tcW w:type="dxa" w:w="1888"/>
-            <w:vMerge/>
-          </w:tcPr>
-          <w:p/>
-        </w:tc>
-        <w:tc>
-          <w:tcPr>
-            <w:tcW w:type="dxa" w:w="3888"/>
+            <w:tcW w:type="dxa" w:w="1872"/>
+            <w:vMerge w:val="restart"/>
+            <w:shd w:fill="D9E1F2"/>
             <w:tcMar>
               <w:top w:w="60" w:type="dxa"/>
               <w:bottom w:w="60" w:type="dxa"/>
@@ -4277,9 +5111,56 @@
           <w:p>
             <w:r>
               <w:rPr>
+                <w:b/>
+                <w:color w:val="1B365D"/>
+                <w:sz w:val="17"/>
+              </w:rPr>
+              <w:t>V. SURVEILLANCE DES IAS</w:t>
+            </w:r>
+          </w:p>
+        </w:tc>
+        <w:tc>
+          <w:tcPr>
+            <w:tcW w:type="dxa" w:w="2304"/>
+            <w:vMerge w:val="restart"/>
+            <w:shd w:fill="F2F2F2"/>
+            <w:tcMar>
+              <w:top w:w="60" w:type="dxa"/>
+              <w:bottom w:w="60" w:type="dxa"/>
+              <w:left w:w="60" w:type="dxa"/>
+              <w:right w:w="60" w:type="dxa"/>
+            </w:tcMar>
+          </w:tcPr>
+          <w:p>
+            <w:r>
+              <w:rPr>
+                <w:b/>
+                <w:sz w:val="15"/>
+              </w:rPr>
+              <w:t>5.1. Dispositif de surveillance épidémiologique des infections associées aux soins</w:t>
+            </w:r>
+          </w:p>
+        </w:tc>
+        <w:tc>
+          <w:tcPr>
+            <w:tcW w:type="dxa" w:w="3888"/>
+            <w:tcMar>
+              <w:top w:w="60" w:type="dxa"/>
+              <w:bottom w:w="60" w:type="dxa"/>
+              <w:left w:w="60" w:type="dxa"/>
+              <w:right w:w="60" w:type="dxa"/>
+            </w:tcMar>
+          </w:tcPr>
+          <w:p>
+            <w:r>
+              <w:rPr>
                 <w:sz w:val="16"/>
               </w:rPr>
-              <w:t>4.1.3. Assurer le suivi rapproché de la mise en œuvre des décisions du CLIN et des recommandations d'audit</w:t>
+              <w:t>5.1.1. Élaborer, valider et déployer le plan institutionnel de surveillance des Infections Associées aux Soins (IAS) :</w:t>
+              <w:br/>
+              <w:t>- Définir les protocoles de surveillance ciblée (Infections du Site Opératoire, bactériémies sur cathéter, infections urinaires sur sonde, infections néonatales)</w:t>
+              <w:br/>
+              <w:t>- Standardiser les fiches de recueil et de notification</w:t>
             </w:r>
           </w:p>
         </w:tc>
@@ -4301,7 +5182,7 @@
               <w:rPr>
                 <w:sz w:val="15"/>
               </w:rPr>
-              <w:t>EOPCI / DAF / DG</w:t>
+              <w:t>EOPCI / Réanimation / Maternité / Pédiatrie</w:t>
             </w:r>
           </w:p>
         </w:tc>
@@ -4323,7 +5204,7 @@
               <w:rPr>
                 <w:sz w:val="15"/>
               </w:rPr>
-              <w:t>Continu</w:t>
+              <w:t>Novembre - Décembre 2026</w:t>
             </w:r>
           </w:p>
         </w:tc>
@@ -4342,7 +5223,7 @@
               <w:rPr>
                 <w:sz w:val="15"/>
               </w:rPr>
-              <w:t>Faible traçabilité et application des résolutions antérieures</w:t>
+              <w:t>Protocole institutionnel de surveillance inexistant</w:t>
             </w:r>
           </w:p>
         </w:tc>
@@ -4361,7 +5242,7 @@
               <w:rPr>
                 <w:sz w:val="15"/>
               </w:rPr>
-              <w:t>Tableau de bord de mise en œuvre des recommandations actualisé chaque trimestre</w:t>
+              <w:t>Plan et protocoles de surveillance des IAS validés et déployés</w:t>
             </w:r>
           </w:p>
         </w:tc>
@@ -4381,9 +5262,10 @@
             </w:pPr>
             <w:r>
               <w:rPr>
+                <w:b/>
                 <w:sz w:val="15"/>
               </w:rPr>
-              <w:t>Néant</w:t>
+              <w:t>FP</w:t>
             </w:r>
           </w:p>
         </w:tc>
@@ -4394,9 +5276,21 @@
         </w:trPr>
         <w:tc>
           <w:tcPr>
-            <w:tcW w:type="dxa" w:w="1872"/>
-            <w:vMerge w:val="restart"/>
-            <w:shd w:fill="D9E1F2"/>
+            <w:tcW w:type="dxa" w:w="1888"/>
+            <w:vMerge/>
+          </w:tcPr>
+          <w:p/>
+        </w:tc>
+        <w:tc>
+          <w:tcPr>
+            <w:tcW w:type="dxa" w:w="1888"/>
+            <w:vMerge/>
+          </w:tcPr>
+          <w:p/>
+        </w:tc>
+        <w:tc>
+          <w:tcPr>
+            <w:tcW w:type="dxa" w:w="3888"/>
             <w:tcMar>
               <w:top w:w="60" w:type="dxa"/>
               <w:bottom w:w="60" w:type="dxa"/>
@@ -4407,56 +5301,9 @@
           <w:p>
             <w:r>
               <w:rPr>
-                <w:b/>
-                <w:color w:val="1B365D"/>
-                <w:sz w:val="17"/>
-              </w:rPr>
-              <w:t>V. SURVEILLANCE DES IAS</w:t>
-            </w:r>
-          </w:p>
-        </w:tc>
-        <w:tc>
-          <w:tcPr>
-            <w:tcW w:type="dxa" w:w="2304"/>
-            <w:vMerge w:val="restart"/>
-            <w:shd w:fill="F2F2F2"/>
-            <w:tcMar>
-              <w:top w:w="60" w:type="dxa"/>
-              <w:bottom w:w="60" w:type="dxa"/>
-              <w:left w:w="60" w:type="dxa"/>
-              <w:right w:w="60" w:type="dxa"/>
-            </w:tcMar>
-          </w:tcPr>
-          <w:p>
-            <w:r>
-              <w:rPr>
-                <w:b/>
-                <w:sz w:val="15"/>
-              </w:rPr>
-              <w:t>5.1. Dispositif de surveillance épidémiologique des infections associées aux soins</w:t>
-            </w:r>
-          </w:p>
-        </w:tc>
-        <w:tc>
-          <w:tcPr>
-            <w:tcW w:type="dxa" w:w="3888"/>
-            <w:tcMar>
-              <w:top w:w="60" w:type="dxa"/>
-              <w:bottom w:w="60" w:type="dxa"/>
-              <w:left w:w="60" w:type="dxa"/>
-              <w:right w:w="60" w:type="dxa"/>
-            </w:tcMar>
-          </w:tcPr>
-          <w:p>
-            <w:r>
-              <w:rPr>
                 <w:sz w:val="16"/>
               </w:rPr>
-              <w:t>5.1.1. Élaborer, valider et déployer le plan institutionnel de surveillance des Infections Associées aux Soins (IAS) :</w:t>
-              <w:br/>
-              <w:t>- Définir les protocoles de surveillance ciblée (Infections du Site Opératoire, bactériémies sur cathéter, infections urinaires sur sonde, infections néonatales)</w:t>
-              <w:br/>
-              <w:t>- Standardiser les fiches de recueil et de notification</w:t>
+              <w:t>5.1.2. Organiser des enquêtes épidémiologiques sur les IAS (une enquête approfondie dans les départements d’intérêt au CHU-MEL : réanimation, néonatalogie, maternité, chirurgie)</w:t>
             </w:r>
           </w:p>
         </w:tc>
@@ -4478,7 +5325,7 @@
               <w:rPr>
                 <w:sz w:val="15"/>
               </w:rPr>
-              <w:t>EOPCI / Réanimation / Maternité / Pédiatrie</w:t>
+              <w:t>EOPCI / Équipes de soins</w:t>
             </w:r>
           </w:p>
         </w:tc>
@@ -4500,7 +5347,7 @@
               <w:rPr>
                 <w:sz w:val="15"/>
               </w:rPr>
-              <w:t>Novembre - Décembre 2026</w:t>
+              <w:t>Janvier 2027 et Juillet 2027</w:t>
             </w:r>
           </w:p>
         </w:tc>
@@ -4519,7 +5366,7 @@
               <w:rPr>
                 <w:sz w:val="15"/>
               </w:rPr>
-              <w:t>Protocole institutionnel de surveillance inexistant</w:t>
+              <w:t>Taux de prévalence global des IAS au CHUMEL méconnu</w:t>
             </w:r>
           </w:p>
         </w:tc>
@@ -4538,7 +5385,7 @@
               <w:rPr>
                 <w:sz w:val="15"/>
               </w:rPr>
-              <w:t>Plan et protocoles de surveillance des IAS validés et déployés</w:t>
+              <w:t>Enquête de prévalence réalisée et rapport analytique diffusé avec identification des facteurs de risque</w:t>
             </w:r>
           </w:p>
         </w:tc>
@@ -4599,7 +5446,7 @@
               <w:rPr>
                 <w:sz w:val="16"/>
               </w:rPr>
-              <w:t>5.1.2. Organiser des enquêtes épidémiologiques sur les IAS (deux enquêtes de prévalence un jour donné dans l'ensemble des départements d'hospitalisation du CHUMEL)</w:t>
+              <w:t>5.1.3. Organiser la collecte hebdomadaire de données sur les IAS par les points focaux IAS de service</w:t>
             </w:r>
           </w:p>
         </w:tc>
@@ -4621,7 +5468,7 @@
               <w:rPr>
                 <w:sz w:val="15"/>
               </w:rPr>
-              <w:t>EOPCI / Équipes de soins</w:t>
+              <w:t>Points focaux de service / EOPCI</w:t>
             </w:r>
           </w:p>
         </w:tc>
@@ -4643,7 +5490,7 @@
               <w:rPr>
                 <w:sz w:val="15"/>
               </w:rPr>
-              <w:t>Janvier 2027 et Juillet 2027</w:t>
+              <w:t>Hebdomadaire (Continu)</w:t>
             </w:r>
           </w:p>
         </w:tc>
@@ -4662,7 +5509,7 @@
               <w:rPr>
                 <w:sz w:val="15"/>
               </w:rPr>
-              <w:t>Taux de prévalence global des IAS au CHUMEL méconnu</w:t>
+              <w:t>Absence de recueil hebdomadaire standardisé</w:t>
             </w:r>
           </w:p>
         </w:tc>
@@ -4681,7 +5528,7 @@
               <w:rPr>
                 <w:sz w:val="15"/>
               </w:rPr>
-              <w:t>2 enquêtes de prévalence un jour donné réalisées et rapports analytiques diffusés</w:t>
+              <w:t>Fiches de notification hebdomadaire renseignées et transmises à l'EOPCI dans 100% des services cibles</w:t>
             </w:r>
           </w:p>
         </w:tc>
@@ -4705,6 +5552,148 @@
                 <w:sz w:val="15"/>
               </w:rPr>
               <w:t>FP</w:t>
+            </w:r>
+          </w:p>
+        </w:tc>
+      </w:tr>
+      <w:tr>
+        <w:trPr>
+          <w:cantSplit/>
+        </w:trPr>
+        <w:tc>
+          <w:tcPr>
+            <w:tcW w:type="dxa" w:w="1888"/>
+            <w:vMerge/>
+          </w:tcPr>
+          <w:p/>
+        </w:tc>
+        <w:tc>
+          <w:tcPr>
+            <w:tcW w:type="dxa" w:w="1888"/>
+            <w:vMerge/>
+          </w:tcPr>
+          <w:p/>
+        </w:tc>
+        <w:tc>
+          <w:tcPr>
+            <w:tcW w:type="dxa" w:w="3888"/>
+            <w:tcMar>
+              <w:top w:w="60" w:type="dxa"/>
+              <w:bottom w:w="60" w:type="dxa"/>
+              <w:left w:w="60" w:type="dxa"/>
+              <w:right w:w="60" w:type="dxa"/>
+            </w:tcMar>
+          </w:tcPr>
+          <w:p>
+            <w:r>
+              <w:rPr>
+                <w:sz w:val="16"/>
+              </w:rPr>
+              <w:t>5.1.4. Faire une analyse hebdomadaire des données sur les IAS et présenter les résultats à la réunion hebdomadaire de l’EOPCI</w:t>
+            </w:r>
+          </w:p>
+        </w:tc>
+        <w:tc>
+          <w:tcPr>
+            <w:tcW w:type="dxa" w:w="1296"/>
+            <w:tcMar>
+              <w:top w:w="60" w:type="dxa"/>
+              <w:bottom w:w="60" w:type="dxa"/>
+              <w:left w:w="40" w:type="dxa"/>
+              <w:right w:w="40" w:type="dxa"/>
+            </w:tcMar>
+          </w:tcPr>
+          <w:p>
+            <w:pPr>
+              <w:jc w:val="center"/>
+            </w:pPr>
+            <w:r>
+              <w:rPr>
+                <w:sz w:val="15"/>
+              </w:rPr>
+              <w:t>Épidémiologiste / Point focal / EOPCI</w:t>
+            </w:r>
+          </w:p>
+        </w:tc>
+        <w:tc>
+          <w:tcPr>
+            <w:tcW w:type="dxa" w:w="1296"/>
+            <w:tcMar>
+              <w:top w:w="60" w:type="dxa"/>
+              <w:bottom w:w="60" w:type="dxa"/>
+              <w:left w:w="40" w:type="dxa"/>
+              <w:right w:w="40" w:type="dxa"/>
+            </w:tcMar>
+          </w:tcPr>
+          <w:p>
+            <w:pPr>
+              <w:jc w:val="center"/>
+            </w:pPr>
+            <w:r>
+              <w:rPr>
+                <w:sz w:val="15"/>
+              </w:rPr>
+              <w:t>Hebdomadaire (Continu)</w:t>
+            </w:r>
+          </w:p>
+        </w:tc>
+        <w:tc>
+          <w:tcPr>
+            <w:tcW w:type="dxa" w:w="2016"/>
+            <w:tcMar>
+              <w:top w:w="60" w:type="dxa"/>
+              <w:bottom w:w="60" w:type="dxa"/>
+              <w:left w:w="60" w:type="dxa"/>
+              <w:right w:w="60" w:type="dxa"/>
+            </w:tcMar>
+          </w:tcPr>
+          <w:p>
+            <w:r>
+              <w:rPr>
+                <w:sz w:val="15"/>
+              </w:rPr>
+              <w:t>Données brutes non analysées en temps réel</w:t>
+            </w:r>
+          </w:p>
+        </w:tc>
+        <w:tc>
+          <w:tcPr>
+            <w:tcW w:type="dxa" w:w="2160"/>
+            <w:tcMar>
+              <w:top w:w="60" w:type="dxa"/>
+              <w:bottom w:w="60" w:type="dxa"/>
+              <w:left w:w="60" w:type="dxa"/>
+              <w:right w:w="60" w:type="dxa"/>
+            </w:tcMar>
+          </w:tcPr>
+          <w:p>
+            <w:r>
+              <w:rPr>
+                <w:sz w:val="15"/>
+              </w:rPr>
+              <w:t>52 synthèses hebdomadaires produites et intégrées au tableau de bord des alertes de l'EOPCI</w:t>
+            </w:r>
+          </w:p>
+        </w:tc>
+        <w:tc>
+          <w:tcPr>
+            <w:tcW w:type="dxa" w:w="1152"/>
+            <w:tcMar>
+              <w:top w:w="60" w:type="dxa"/>
+              <w:bottom w:w="60" w:type="dxa"/>
+              <w:left w:w="40" w:type="dxa"/>
+              <w:right w:w="40" w:type="dxa"/>
+            </w:tcMar>
+          </w:tcPr>
+          <w:p>
+            <w:pPr>
+              <w:jc w:val="center"/>
+            </w:pPr>
+            <w:r>
+              <w:rPr>
+                <w:sz w:val="15"/>
+              </w:rPr>
+              <w:t>Néant</w:t>
             </w:r>
           </w:p>
         </w:tc>
@@ -4992,497 +5981,6 @@
                 <w:sz w:val="15"/>
               </w:rPr>
               <w:t>33 séries de contrôles microbiologiques exécutées avec cartographie complète de l'écologie microbienne du CHUMEL</w:t>
-            </w:r>
-          </w:p>
-        </w:tc>
-        <w:tc>
-          <w:tcPr>
-            <w:tcW w:type="dxa" w:w="1152"/>
-            <w:tcMar>
-              <w:top w:w="60" w:type="dxa"/>
-              <w:bottom w:w="60" w:type="dxa"/>
-              <w:left w:w="40" w:type="dxa"/>
-              <w:right w:w="40" w:type="dxa"/>
-            </w:tcMar>
-          </w:tcPr>
-          <w:p>
-            <w:pPr>
-              <w:jc w:val="center"/>
-            </w:pPr>
-            <w:r>
-              <w:rPr>
-                <w:b/>
-                <w:sz w:val="15"/>
-              </w:rPr>
-              <w:t>FP</w:t>
-            </w:r>
-          </w:p>
-        </w:tc>
-      </w:tr>
-      <w:tr>
-        <w:trPr>
-          <w:cantSplit/>
-        </w:trPr>
-        <w:tc>
-          <w:tcPr>
-            <w:tcW w:type="dxa" w:w="1872"/>
-            <w:vMerge w:val="restart"/>
-            <w:shd w:fill="D9E1F2"/>
-            <w:tcMar>
-              <w:top w:w="60" w:type="dxa"/>
-              <w:bottom w:w="60" w:type="dxa"/>
-              <w:left w:w="60" w:type="dxa"/>
-              <w:right w:w="60" w:type="dxa"/>
-            </w:tcMar>
-          </w:tcPr>
-          <w:p>
-            <w:r>
-              <w:rPr>
-                <w:b/>
-                <w:color w:val="1B365D"/>
-                <w:sz w:val="17"/>
-              </w:rPr>
-              <w:t>VI. STRATÉGIES MULTIMODALES</w:t>
-            </w:r>
-          </w:p>
-        </w:tc>
-        <w:tc>
-          <w:tcPr>
-            <w:tcW w:type="dxa" w:w="2304"/>
-            <w:shd w:fill="F2F2F2"/>
-            <w:tcMar>
-              <w:top w:w="60" w:type="dxa"/>
-              <w:bottom w:w="60" w:type="dxa"/>
-              <w:left w:w="60" w:type="dxa"/>
-              <w:right w:w="60" w:type="dxa"/>
-            </w:tcMar>
-          </w:tcPr>
-          <w:p>
-            <w:r>
-              <w:rPr>
-                <w:b/>
-                <w:sz w:val="15"/>
-              </w:rPr>
-              <w:t>6.1. Institutionnalisation de la démarche multimodale de l'OMS pour la PCI</w:t>
-            </w:r>
-          </w:p>
-        </w:tc>
-        <w:tc>
-          <w:tcPr>
-            <w:tcW w:type="dxa" w:w="3888"/>
-            <w:tcMar>
-              <w:top w:w="60" w:type="dxa"/>
-              <w:bottom w:w="60" w:type="dxa"/>
-              <w:left w:w="60" w:type="dxa"/>
-              <w:right w:w="60" w:type="dxa"/>
-            </w:tcMar>
-          </w:tcPr>
-          <w:p>
-            <w:r>
-              <w:rPr>
-                <w:sz w:val="16"/>
-              </w:rPr>
-              <w:t>6.1.1. Intégrer systématiquement les cinq composantes de la stratégie multimodale de l’OMS dans chaque plan d’action opérationnel du CHUMEL :</w:t>
-              <w:br/>
-              <w:t>1- Changement de système (disponibilité continue des intrants au point de soins)</w:t>
-              <w:br/>
-              <w:t>2- Éducation et formation continue des équipes</w:t>
-              <w:br/>
-              <w:t>3- Surveillance, audits et rétro-information aux soignants</w:t>
-              <w:br/>
-              <w:t>4- Rappels visuels sur le lieu de travail et communication ergonomique</w:t>
-              <w:br/>
-              <w:t>5- Climat de sécurité organisationnel et culture de sécurité positive</w:t>
-            </w:r>
-          </w:p>
-        </w:tc>
-        <w:tc>
-          <w:tcPr>
-            <w:tcW w:type="dxa" w:w="1296"/>
-            <w:tcMar>
-              <w:top w:w="60" w:type="dxa"/>
-              <w:bottom w:w="60" w:type="dxa"/>
-              <w:left w:w="40" w:type="dxa"/>
-              <w:right w:w="40" w:type="dxa"/>
-            </w:tcMar>
-          </w:tcPr>
-          <w:p>
-            <w:pPr>
-              <w:jc w:val="center"/>
-            </w:pPr>
-            <w:r>
-              <w:rPr>
-                <w:sz w:val="15"/>
-              </w:rPr>
-              <w:t>EOPCI / CLIN / Chefs de services</w:t>
-            </w:r>
-          </w:p>
-        </w:tc>
-        <w:tc>
-          <w:tcPr>
-            <w:tcW w:type="dxa" w:w="1296"/>
-            <w:tcMar>
-              <w:top w:w="60" w:type="dxa"/>
-              <w:bottom w:w="60" w:type="dxa"/>
-              <w:left w:w="40" w:type="dxa"/>
-              <w:right w:w="40" w:type="dxa"/>
-            </w:tcMar>
-          </w:tcPr>
-          <w:p>
-            <w:pPr>
-              <w:jc w:val="center"/>
-            </w:pPr>
-            <w:r>
-              <w:rPr>
-                <w:sz w:val="15"/>
-              </w:rPr>
-              <w:t>Continu (Janvier - Septembre 2027)</w:t>
-            </w:r>
-          </w:p>
-        </w:tc>
-        <w:tc>
-          <w:tcPr>
-            <w:tcW w:type="dxa" w:w="2016"/>
-            <w:tcMar>
-              <w:top w:w="60" w:type="dxa"/>
-              <w:bottom w:w="60" w:type="dxa"/>
-              <w:left w:w="60" w:type="dxa"/>
-              <w:right w:w="60" w:type="dxa"/>
-            </w:tcMar>
-          </w:tcPr>
-          <w:p>
-            <w:r>
-              <w:rPr>
-                <w:sz w:val="15"/>
-              </w:rPr>
-              <w:t>Actions isolées non coordonnées selon le modèle OMS</w:t>
-            </w:r>
-          </w:p>
-        </w:tc>
-        <w:tc>
-          <w:tcPr>
-            <w:tcW w:type="dxa" w:w="2160"/>
-            <w:tcMar>
-              <w:top w:w="60" w:type="dxa"/>
-              <w:bottom w:w="60" w:type="dxa"/>
-              <w:left w:w="60" w:type="dxa"/>
-              <w:right w:w="60" w:type="dxa"/>
-            </w:tcMar>
-          </w:tcPr>
-          <w:p>
-            <w:r>
-              <w:rPr>
-                <w:sz w:val="15"/>
-              </w:rPr>
-              <w:t>100% des interventions de PCI conçues et déployées selon les 5 composantes multimodales de l'OMS</w:t>
-            </w:r>
-          </w:p>
-        </w:tc>
-        <w:tc>
-          <w:tcPr>
-            <w:tcW w:type="dxa" w:w="1152"/>
-            <w:tcMar>
-              <w:top w:w="60" w:type="dxa"/>
-              <w:bottom w:w="60" w:type="dxa"/>
-              <w:left w:w="40" w:type="dxa"/>
-              <w:right w:w="40" w:type="dxa"/>
-            </w:tcMar>
-          </w:tcPr>
-          <w:p>
-            <w:pPr>
-              <w:jc w:val="center"/>
-            </w:pPr>
-            <w:r>
-              <w:rPr>
-                <w:sz w:val="15"/>
-              </w:rPr>
-              <w:t>Néant</w:t>
-            </w:r>
-          </w:p>
-        </w:tc>
-      </w:tr>
-      <w:tr>
-        <w:trPr>
-          <w:cantSplit/>
-        </w:trPr>
-        <w:tc>
-          <w:tcPr>
-            <w:tcW w:type="dxa" w:w="1888"/>
-            <w:vMerge/>
-          </w:tcPr>
-          <w:p/>
-        </w:tc>
-        <w:tc>
-          <w:tcPr>
-            <w:tcW w:type="dxa" w:w="2304"/>
-            <w:vMerge w:val="restart"/>
-            <w:shd w:fill="F2F2F2"/>
-            <w:tcMar>
-              <w:top w:w="60" w:type="dxa"/>
-              <w:bottom w:w="60" w:type="dxa"/>
-              <w:left w:w="60" w:type="dxa"/>
-              <w:right w:w="60" w:type="dxa"/>
-            </w:tcMar>
-          </w:tcPr>
-          <w:p>
-            <w:r>
-              <w:rPr>
-                <w:b/>
-                <w:sz w:val="15"/>
-              </w:rPr>
-              <w:t>6.2. Communication, outils de sensibilisation et affiches pédagogiques</w:t>
-            </w:r>
-          </w:p>
-        </w:tc>
-        <w:tc>
-          <w:tcPr>
-            <w:tcW w:type="dxa" w:w="3888"/>
-            <w:tcMar>
-              <w:top w:w="60" w:type="dxa"/>
-              <w:bottom w:w="60" w:type="dxa"/>
-              <w:left w:w="60" w:type="dxa"/>
-              <w:right w:w="60" w:type="dxa"/>
-            </w:tcMar>
-          </w:tcPr>
-          <w:p>
-            <w:r>
-              <w:rPr>
-                <w:sz w:val="16"/>
-              </w:rPr>
-              <w:t>6.2.1. Élaborer, concevoir et faire reproduire les supports visuels de communication et affiches de sensibilisation :</w:t>
-              <w:br/>
-              <w:t>- Affiches plastifiées « Les 5 indications de l'OMS pour l'hygiène des mains »</w:t>
-              <w:br/>
-              <w:t>- Affiches techniques de friction hydro-alcoolique et de lavage des mains</w:t>
-              <w:br/>
-              <w:t>- Affiches du code couleur pour le tri des déchets biomédicaux</w:t>
-              <w:br/>
-              <w:t>- Affiches d'habillage/déshabillage des Équipements de Protection Individuelle (EPI)</w:t>
-            </w:r>
-          </w:p>
-        </w:tc>
-        <w:tc>
-          <w:tcPr>
-            <w:tcW w:type="dxa" w:w="1296"/>
-            <w:tcMar>
-              <w:top w:w="60" w:type="dxa"/>
-              <w:bottom w:w="60" w:type="dxa"/>
-              <w:left w:w="40" w:type="dxa"/>
-              <w:right w:w="40" w:type="dxa"/>
-            </w:tcMar>
-          </w:tcPr>
-          <w:p>
-            <w:pPr>
-              <w:jc w:val="center"/>
-            </w:pPr>
-            <w:r>
-              <w:rPr>
-                <w:sz w:val="15"/>
-              </w:rPr>
-              <w:t>EOPCI / Service communication</w:t>
-            </w:r>
-          </w:p>
-        </w:tc>
-        <w:tc>
-          <w:tcPr>
-            <w:tcW w:type="dxa" w:w="1296"/>
-            <w:tcMar>
-              <w:top w:w="60" w:type="dxa"/>
-              <w:bottom w:w="60" w:type="dxa"/>
-              <w:left w:w="40" w:type="dxa"/>
-              <w:right w:w="40" w:type="dxa"/>
-            </w:tcMar>
-          </w:tcPr>
-          <w:p>
-            <w:pPr>
-              <w:jc w:val="center"/>
-            </w:pPr>
-            <w:r>
-              <w:rPr>
-                <w:sz w:val="15"/>
-              </w:rPr>
-              <w:t>Décembre 2026 - Février 2027</w:t>
-            </w:r>
-          </w:p>
-        </w:tc>
-        <w:tc>
-          <w:tcPr>
-            <w:tcW w:type="dxa" w:w="2016"/>
-            <w:tcMar>
-              <w:top w:w="60" w:type="dxa"/>
-              <w:bottom w:w="60" w:type="dxa"/>
-              <w:left w:w="60" w:type="dxa"/>
-              <w:right w:w="60" w:type="dxa"/>
-            </w:tcMar>
-          </w:tcPr>
-          <w:p>
-            <w:r>
-              <w:rPr>
-                <w:sz w:val="15"/>
-              </w:rPr>
-              <w:t>Supports visuels inexistants, dégradés ou obsolètes</w:t>
-            </w:r>
-          </w:p>
-        </w:tc>
-        <w:tc>
-          <w:tcPr>
-            <w:tcW w:type="dxa" w:w="2160"/>
-            <w:tcMar>
-              <w:top w:w="60" w:type="dxa"/>
-              <w:bottom w:w="60" w:type="dxa"/>
-              <w:left w:w="60" w:type="dxa"/>
-              <w:right w:w="60" w:type="dxa"/>
-            </w:tcMar>
-          </w:tcPr>
-          <w:p>
-            <w:r>
-              <w:rPr>
-                <w:sz w:val="15"/>
-              </w:rPr>
-              <w:t>300 affiches et posters plastifiés posés au-dessus de chaque lavabo, paillasse et lit d'hospitalisation</w:t>
-            </w:r>
-          </w:p>
-        </w:tc>
-        <w:tc>
-          <w:tcPr>
-            <w:tcW w:type="dxa" w:w="1152"/>
-            <w:tcMar>
-              <w:top w:w="60" w:type="dxa"/>
-              <w:bottom w:w="60" w:type="dxa"/>
-              <w:left w:w="40" w:type="dxa"/>
-              <w:right w:w="40" w:type="dxa"/>
-            </w:tcMar>
-          </w:tcPr>
-          <w:p>
-            <w:pPr>
-              <w:jc w:val="center"/>
-            </w:pPr>
-            <w:r>
-              <w:rPr>
-                <w:b/>
-                <w:sz w:val="15"/>
-              </w:rPr>
-              <w:t>FP</w:t>
-            </w:r>
-          </w:p>
-        </w:tc>
-      </w:tr>
-      <w:tr>
-        <w:trPr>
-          <w:cantSplit/>
-        </w:trPr>
-        <w:tc>
-          <w:tcPr>
-            <w:tcW w:type="dxa" w:w="1888"/>
-            <w:vMerge/>
-          </w:tcPr>
-          <w:p/>
-        </w:tc>
-        <w:tc>
-          <w:tcPr>
-            <w:tcW w:type="dxa" w:w="1888"/>
-            <w:vMerge/>
-          </w:tcPr>
-          <w:p/>
-        </w:tc>
-        <w:tc>
-          <w:tcPr>
-            <w:tcW w:type="dxa" w:w="3888"/>
-            <w:tcMar>
-              <w:top w:w="60" w:type="dxa"/>
-              <w:bottom w:w="60" w:type="dxa"/>
-              <w:left w:w="60" w:type="dxa"/>
-              <w:right w:w="60" w:type="dxa"/>
-            </w:tcMar>
-          </w:tcPr>
-          <w:p>
-            <w:r>
-              <w:rPr>
-                <w:sz w:val="16"/>
-              </w:rPr>
-              <w:t>6.2.2. Réaliser des campagnes institutionnelles de communication et sensibilisation du personnel et des usagers sur l'hygiène des mains et la propreté hospitalière</w:t>
-            </w:r>
-          </w:p>
-        </w:tc>
-        <w:tc>
-          <w:tcPr>
-            <w:tcW w:type="dxa" w:w="1296"/>
-            <w:tcMar>
-              <w:top w:w="60" w:type="dxa"/>
-              <w:bottom w:w="60" w:type="dxa"/>
-              <w:left w:w="40" w:type="dxa"/>
-              <w:right w:w="40" w:type="dxa"/>
-            </w:tcMar>
-          </w:tcPr>
-          <w:p>
-            <w:pPr>
-              <w:jc w:val="center"/>
-            </w:pPr>
-            <w:r>
-              <w:rPr>
-                <w:sz w:val="15"/>
-              </w:rPr>
-              <w:t>EOPCI / Points focaux</w:t>
-            </w:r>
-          </w:p>
-        </w:tc>
-        <w:tc>
-          <w:tcPr>
-            <w:tcW w:type="dxa" w:w="1296"/>
-            <w:tcMar>
-              <w:top w:w="60" w:type="dxa"/>
-              <w:bottom w:w="60" w:type="dxa"/>
-              <w:left w:w="40" w:type="dxa"/>
-              <w:right w:w="40" w:type="dxa"/>
-            </w:tcMar>
-          </w:tcPr>
-          <w:p>
-            <w:pPr>
-              <w:jc w:val="center"/>
-            </w:pPr>
-            <w:r>
-              <w:rPr>
-                <w:sz w:val="15"/>
-              </w:rPr>
-              <w:t>Trimestriel (T1 à T4)</w:t>
-            </w:r>
-          </w:p>
-        </w:tc>
-        <w:tc>
-          <w:tcPr>
-            <w:tcW w:type="dxa" w:w="2016"/>
-            <w:tcMar>
-              <w:top w:w="60" w:type="dxa"/>
-              <w:bottom w:w="60" w:type="dxa"/>
-              <w:left w:w="60" w:type="dxa"/>
-              <w:right w:w="60" w:type="dxa"/>
-            </w:tcMar>
-          </w:tcPr>
-          <w:p>
-            <w:r>
-              <w:rPr>
-                <w:sz w:val="15"/>
-              </w:rPr>
-              <w:t>Engagement variable et sensibilisation discontinue</w:t>
-            </w:r>
-          </w:p>
-        </w:tc>
-        <w:tc>
-          <w:tcPr>
-            <w:tcW w:type="dxa" w:w="2160"/>
-            <w:tcMar>
-              <w:top w:w="60" w:type="dxa"/>
-              <w:bottom w:w="60" w:type="dxa"/>
-              <w:left w:w="60" w:type="dxa"/>
-              <w:right w:w="60" w:type="dxa"/>
-            </w:tcMar>
-          </w:tcPr>
-          <w:p>
-            <w:r>
-              <w:rPr>
-                <w:sz w:val="15"/>
-              </w:rPr>
-              <w:t>4 campagnes de proximité menées avec renforcement mesurable du climat de sécurité</w:t>
             </w:r>
           </w:p>
         </w:tc>
@@ -5868,6 +6366,8 @@
               <w:t>- 1 Disque dur SSD externe 1 To et 1 clé USB 32 Go (sauvegarde et archivage)</w:t>
               <w:br/>
               <w:t>- 1 Armoire de rangement sécurisée des archives du CLIN</w:t>
+              <w:br/>
+              <w:t>- Fournitures de bureau</w:t>
             </w:r>
           </w:p>
         </w:tc>
@@ -5949,7 +6449,7 @@
               <w:rPr>
                 <w:sz w:val="15"/>
               </w:rPr>
-              <w:t>Unité PCI dotée d'équipements informatiques et d'une armoire de rangement neufs et fonctionnels</w:t>
+              <w:t>Unité PCI dotée d'équipements informatiques, d'une armoire de rangement et de fournitures de bureau neufs et fonctionnels</w:t>
             </w:r>
           </w:p>
         </w:tc>
@@ -6311,7 +6811,7 @@
               <w:rPr>
                 <w:sz w:val="16"/>
               </w:rPr>
-              <w:t>7.2.3. Réaliser des audits internes PCI trimestriels sur la gestion des cathéters veineux, la gestion des DBM et le bionettoyage dans l'ensemble des départements</w:t>
+              <w:t>7.2.3. Réaliser des audits internes PCI trimestriels sur la gestion des cathéters veineux, la gestion des DBM et le bionettoyage dans l'ensemble des services</w:t>
             </w:r>
           </w:p>
         </w:tc>
@@ -6434,9 +6934,14 @@
         </w:tc>
         <w:tc>
           <w:tcPr>
-            <w:tcW w:type="dxa" w:w="2304"/>
-            <w:vMerge w:val="restart"/>
-            <w:shd w:fill="F2F2F2"/>
+            <w:tcW w:type="dxa" w:w="1888"/>
+            <w:vMerge/>
+          </w:tcPr>
+          <w:p/>
+        </w:tc>
+        <w:tc>
+          <w:tcPr>
+            <w:tcW w:type="dxa" w:w="3888"/>
             <w:tcMar>
               <w:top w:w="60" w:type="dxa"/>
               <w:bottom w:w="60" w:type="dxa"/>
@@ -6447,37 +6952,9 @@
           <w:p>
             <w:r>
               <w:rPr>
-                <w:b/>
-                <w:sz w:val="15"/>
-              </w:rPr>
-              <w:t>7.3. Journée mondiale de l'hygiène des mains et restitution des données</w:t>
-            </w:r>
-          </w:p>
-        </w:tc>
-        <w:tc>
-          <w:tcPr>
-            <w:tcW w:type="dxa" w:w="3888"/>
-            <w:tcMar>
-              <w:top w:w="60" w:type="dxa"/>
-              <w:bottom w:w="60" w:type="dxa"/>
-              <w:left w:w="60" w:type="dxa"/>
-              <w:right w:w="60" w:type="dxa"/>
-            </w:tcMar>
-          </w:tcPr>
-          <w:p>
-            <w:r>
-              <w:rPr>
                 <w:sz w:val="16"/>
               </w:rPr>
-              <w:t>7.3.1. Faire une journée de l’hygiène des mains (organisation et célébration de la Journée internationale du 5 mai 2027 « Sauvez des vies : nettoyez-vous les mains ») :</w:t>
-              <w:br/>
-              <w:t>- Conférences thématiques et ateliers de démonstration pratique</w:t>
-              <w:br/>
-              <w:t>- Concours d'émulation du service le plus observant avec remise de prix</w:t>
-              <w:br/>
-              <w:t>- Distribution de flacons individuels de solution hydro-alcoolique (PHA)</w:t>
-              <w:br/>
-              <w:t>- Stands d'information grand public et couverture médiatique</w:t>
+              <w:t>7.2.4. Réaliser un suivi mensuel de la qualité de la gestion des déchets biomédicaux dans les services</w:t>
             </w:r>
           </w:p>
         </w:tc>
@@ -6499,7 +6976,7 @@
               <w:rPr>
                 <w:sz w:val="15"/>
               </w:rPr>
-              <w:t>CLIN / EOPCI / DG</w:t>
+              <w:t>EOPCI / Points focaux / Responsable Salubrité</w:t>
             </w:r>
           </w:p>
         </w:tc>
@@ -6521,7 +6998,7 @@
               <w:rPr>
                 <w:sz w:val="15"/>
               </w:rPr>
-              <w:t>Mai 2027</w:t>
+              <w:t>Mensuel (Continu)</w:t>
             </w:r>
           </w:p>
         </w:tc>
@@ -6540,7 +7017,7 @@
               <w:rPr>
                 <w:sz w:val="15"/>
               </w:rPr>
-              <w:t>Célébration ponctuelle à faible impact</w:t>
+              <w:t>Suivi irrégulier de la qualité du tri</w:t>
             </w:r>
           </w:p>
         </w:tc>
@@ -6559,7 +7036,7 @@
               <w:rPr>
                 <w:sz w:val="15"/>
               </w:rPr>
-              <w:t>Journée célébrée avec succès, mobilisation de plus de 500 professionnels, usagers et étudiants primés</w:t>
+              <w:t>12 grilles mensuelles d'évaluation de la qualité du tri et conditionnement des DBM renseignées avec score &gt; 85%</w:t>
             </w:r>
           </w:p>
         </w:tc>
@@ -6582,7 +7059,7 @@
                 <w:b/>
                 <w:sz w:val="15"/>
               </w:rPr>
-              <w:t>FP / PTF</w:t>
+              <w:t>FP</w:t>
             </w:r>
           </w:p>
         </w:tc>
@@ -6600,14 +7077,8 @@
         </w:tc>
         <w:tc>
           <w:tcPr>
-            <w:tcW w:type="dxa" w:w="1888"/>
-            <w:vMerge/>
-          </w:tcPr>
-          <w:p/>
-        </w:tc>
-        <w:tc>
-          <w:tcPr>
-            <w:tcW w:type="dxa" w:w="3888"/>
+            <w:tcW w:type="dxa" w:w="2304"/>
+            <w:shd w:fill="F2F2F2"/>
             <w:tcMar>
               <w:top w:w="60" w:type="dxa"/>
               <w:bottom w:w="60" w:type="dxa"/>
@@ -6618,9 +7089,29 @@
           <w:p>
             <w:r>
               <w:rPr>
+                <w:b/>
+                <w:sz w:val="15"/>
+              </w:rPr>
+              <w:t>7.3. Restitution des résultats et retour d'information (feedback)</w:t>
+            </w:r>
+          </w:p>
+        </w:tc>
+        <w:tc>
+          <w:tcPr>
+            <w:tcW w:type="dxa" w:w="3888"/>
+            <w:tcMar>
+              <w:top w:w="60" w:type="dxa"/>
+              <w:bottom w:w="60" w:type="dxa"/>
+              <w:left w:w="60" w:type="dxa"/>
+              <w:right w:w="60" w:type="dxa"/>
+            </w:tcMar>
+          </w:tcPr>
+          <w:p>
+            <w:r>
+              <w:rPr>
                 <w:sz w:val="16"/>
               </w:rPr>
-              <w:t>7.3.2. Élaborer un plan de restitution des audits aux parties prenantes et animer les réunions trimestrielles de restitution et retour d'information (feedback)</w:t>
+              <w:t>7.3.1. Élaborer un plan de restitution des audits aux parties prenantes et animer les réunions trimestrielles de restitution et retour d'information (feedback)</w:t>
             </w:r>
           </w:p>
         </w:tc>
@@ -6775,7 +7266,7 @@
                 <w:b/>
                 <w:sz w:val="15"/>
               </w:rPr>
-              <w:t>8.1. Charge de travail, dotation en personnel, fiches de poste et réseau de points focaux</w:t>
+              <w:t>8.1. Charge de travail, dotation en personnel, fiches de poste et organisation</w:t>
             </w:r>
           </w:p>
         </w:tc>
@@ -6794,7 +7285,7 @@
               <w:rPr>
                 <w:sz w:val="16"/>
               </w:rPr>
-              <w:t>8.1.1. Faire l’évaluation de la charge de travail, du niveau de dotation en personnel soignant, de l’occupation des lits et de leurs espacements dans les pôles d'hospitalisation</w:t>
+              <w:t>8.1.1. Faire l’évaluation de la charge de travail, du niveau de dotation en personnel soignant au CHUMEL, ainsi que de l’occupation des lits et de leurs espacements dans les pôles d'hospitalisation</w:t>
             </w:r>
           </w:p>
         </w:tc>
@@ -6876,7 +7367,7 @@
               <w:rPr>
                 <w:sz w:val="15"/>
               </w:rPr>
-              <w:t>Rapport d'évaluation disponible préconisant le respect de l'espacement minimal d'1 mètre et l'adaptation des ratios</w:t>
+              <w:t>Rapport d'évaluation disponible préconisant le respect de l'espacement minimal d'1 mètre et l'adaptation des ratios soignants</w:t>
             </w:r>
           </w:p>
         </w:tc>
@@ -7059,14 +7550,9 @@
         </w:tc>
         <w:tc>
           <w:tcPr>
-            <w:tcW w:type="dxa" w:w="1888"/>
-            <w:vMerge/>
-          </w:tcPr>
-          <w:p/>
-        </w:tc>
-        <w:tc>
-          <w:tcPr>
-            <w:tcW w:type="dxa" w:w="3888"/>
+            <w:tcW w:type="dxa" w:w="2304"/>
+            <w:vMerge w:val="restart"/>
+            <w:shd w:fill="F2F2F2"/>
             <w:tcMar>
               <w:top w:w="60" w:type="dxa"/>
               <w:bottom w:w="60" w:type="dxa"/>
@@ -7077,9 +7563,29 @@
           <w:p>
             <w:r>
               <w:rPr>
+                <w:b/>
+                <w:sz w:val="15"/>
+              </w:rPr>
+              <w:t>8.2. Gestion sécurisée et filière d'élimination des Déchets Biomédicaux (DBM)</w:t>
+            </w:r>
+          </w:p>
+        </w:tc>
+        <w:tc>
+          <w:tcPr>
+            <w:tcW w:type="dxa" w:w="3888"/>
+            <w:tcMar>
+              <w:top w:w="60" w:type="dxa"/>
+              <w:bottom w:w="60" w:type="dxa"/>
+              <w:left w:w="60" w:type="dxa"/>
+              <w:right w:w="60" w:type="dxa"/>
+            </w:tcMar>
+          </w:tcPr>
+          <w:p>
+            <w:r>
+              <w:rPr>
                 <w:sz w:val="16"/>
               </w:rPr>
-              <w:t>8.1.3. Désigner formellement, installer et dynamiser les points focaux PCI dans tous les services cliniques et médico-techniques (binôme soignant et agent d'entretien)</w:t>
+              <w:t>8.2.1. Superviser mensuellement la gestion des déchets biomédicaux dans les services (tri à la source, conditionnement en sacs jaunes, pesée/tonnage, transport interne et stockage temporaire)</w:t>
             </w:r>
           </w:p>
         </w:tc>
@@ -7101,7 +7607,7 @@
               <w:rPr>
                 <w:sz w:val="15"/>
               </w:rPr>
-              <w:t>EOPCI / DG</w:t>
+              <w:t>EOPCI / Service Salubrité</w:t>
             </w:r>
           </w:p>
         </w:tc>
@@ -7123,7 +7629,7 @@
               <w:rPr>
                 <w:sz w:val="15"/>
               </w:rPr>
-              <w:t>Novembre 2026 - Janvier 2027</w:t>
+              <w:t>Mensuel (Continu)</w:t>
             </w:r>
           </w:p>
         </w:tc>
@@ -7142,7 +7648,7 @@
               <w:rPr>
                 <w:sz w:val="15"/>
               </w:rPr>
-              <w:t>Absence de réseau formalisé de relais de terrain</w:t>
+              <w:t>Mélanges fréquents de déchets et ruptures de sacs poubelles</w:t>
             </w:r>
           </w:p>
         </w:tc>
@@ -7161,7 +7667,7 @@
               <w:rPr>
                 <w:sz w:val="15"/>
               </w:rPr>
-              <w:t>24 points focaux nommés par note de service, dotés d'une lettre de mission et opérationnels</w:t>
+              <w:t>12 rapports mensuels de supervision ; taux de conformité du tri à la source supérieur à 80%</w:t>
             </w:r>
           </w:p>
         </w:tc>
@@ -7181,10 +7687,9 @@
             </w:pPr>
             <w:r>
               <w:rPr>
-                <w:b/>
                 <w:sz w:val="15"/>
               </w:rPr>
-              <w:t>FP</w:t>
+              <w:t>Néant</w:t>
             </w:r>
           </w:p>
         </w:tc>
@@ -7202,9 +7707,14 @@
         </w:tc>
         <w:tc>
           <w:tcPr>
-            <w:tcW w:type="dxa" w:w="2304"/>
-            <w:vMerge w:val="restart"/>
-            <w:shd w:fill="F2F2F2"/>
+            <w:tcW w:type="dxa" w:w="1888"/>
+            <w:vMerge/>
+          </w:tcPr>
+          <w:p/>
+        </w:tc>
+        <w:tc>
+          <w:tcPr>
+            <w:tcW w:type="dxa" w:w="3888"/>
             <w:tcMar>
               <w:top w:w="60" w:type="dxa"/>
               <w:bottom w:w="60" w:type="dxa"/>
@@ -7215,29 +7725,9 @@
           <w:p>
             <w:r>
               <w:rPr>
-                <w:b/>
-                <w:sz w:val="15"/>
-              </w:rPr>
-              <w:t>8.2. Gestion sécurisée et filière d'élimination des Déchets Biomédicaux (DBM)</w:t>
-            </w:r>
-          </w:p>
-        </w:tc>
-        <w:tc>
-          <w:tcPr>
-            <w:tcW w:type="dxa" w:w="3888"/>
-            <w:tcMar>
-              <w:top w:w="60" w:type="dxa"/>
-              <w:bottom w:w="60" w:type="dxa"/>
-              <w:left w:w="60" w:type="dxa"/>
-              <w:right w:w="60" w:type="dxa"/>
-            </w:tcMar>
-          </w:tcPr>
-          <w:p>
-            <w:r>
-              <w:rPr>
                 <w:sz w:val="16"/>
               </w:rPr>
-              <w:t>8.2.1. Superviser mensuellement la gestion des déchets biomédicaux dans les services (tri à la source, conditionnement en sacs jaunes, pesée/tonnage, transport interne et stockage temporaire)</w:t>
+              <w:t>8.2.2. Sensibiliser et former le personnel soignant et d'entretien sur le tri rigoureux et la gestion sécurisée des déchets biomédicaux</w:t>
             </w:r>
           </w:p>
         </w:tc>
@@ -7259,7 +7749,7 @@
               <w:rPr>
                 <w:sz w:val="15"/>
               </w:rPr>
-              <w:t>EOPCI / Service Salubrité</w:t>
+              <w:t>Formateurs internes / EOPCI</w:t>
             </w:r>
           </w:p>
         </w:tc>
@@ -7281,7 +7771,7 @@
               <w:rPr>
                 <w:sz w:val="15"/>
               </w:rPr>
-              <w:t>Mensuel (Continu)</w:t>
+              <w:t>Décembre 2026 - Mai 2027</w:t>
             </w:r>
           </w:p>
         </w:tc>
@@ -7300,7 +7790,7 @@
               <w:rPr>
                 <w:sz w:val="15"/>
               </w:rPr>
-              <w:t>Mélanges fréquents de déchets et ruptures de sacs poubelles</w:t>
+              <w:t>Personnel insuffisamment formé aux risques liés aux DBM et AES</w:t>
             </w:r>
           </w:p>
         </w:tc>
@@ -7319,7 +7809,7 @@
               <w:rPr>
                 <w:sz w:val="15"/>
               </w:rPr>
-              <w:t>12 rapports mensuels de supervision ; taux de conformité du tri à la source supérieur à 80%</w:t>
+              <w:t>400 professionnels de santé et d'entretien sensibilisés et formés à la manipulation des DBM</w:t>
             </w:r>
           </w:p>
         </w:tc>
@@ -7339,9 +7829,10 @@
             </w:pPr>
             <w:r>
               <w:rPr>
+                <w:b/>
                 <w:sz w:val="15"/>
               </w:rPr>
-              <w:t>Néant</w:t>
+              <w:t>FP</w:t>
             </w:r>
           </w:p>
         </w:tc>
@@ -7379,7 +7870,7 @@
               <w:rPr>
                 <w:sz w:val="16"/>
               </w:rPr>
-              <w:t>8.2.2. Organiser des campagnes de sensibilisation et formation continue du personnel sur le tri rigoureux et la gestion sécurisée des déchets biomédicaux</w:t>
+              <w:t>8.2.3. Superviser la disponibilité des équipements du lavage des mains, du bionettoyage, du lavage et stérilisation des linges et équipements médicaux (dont 50 poubelles à pédale neuves et peson de tonnage)</w:t>
             </w:r>
           </w:p>
         </w:tc>
@@ -7401,7 +7892,7 @@
               <w:rPr>
                 <w:sz w:val="15"/>
               </w:rPr>
-              <w:t>Formateurs internes / EOPCI</w:t>
+              <w:t>DAF / Économat / EOPCI / Surveillant Général</w:t>
             </w:r>
           </w:p>
         </w:tc>
@@ -7423,7 +7914,7 @@
               <w:rPr>
                 <w:sz w:val="15"/>
               </w:rPr>
-              <w:t>Décembre 2026 - Mai 2027</w:t>
+              <w:t>Novembre - Décembre 2026 puis continu</w:t>
             </w:r>
           </w:p>
         </w:tc>
@@ -7442,7 +7933,7 @@
               <w:rPr>
                 <w:sz w:val="15"/>
               </w:rPr>
-              <w:t>Personnel insuffisamment formé aux risques liés aux DBM et AES</w:t>
+              <w:t>Poubelles vétustes, absence de pédale sur plusieurs postes, absence de pesée systématique</w:t>
             </w:r>
           </w:p>
         </w:tc>
@@ -7461,154 +7952,7 @@
               <w:rPr>
                 <w:sz w:val="15"/>
               </w:rPr>
-              <w:t>400 professionnels de santé et d'entretien sensibilisés et formés à la manipulation des DBM</w:t>
-            </w:r>
-          </w:p>
-        </w:tc>
-        <w:tc>
-          <w:tcPr>
-            <w:tcW w:type="dxa" w:w="1152"/>
-            <w:tcMar>
-              <w:top w:w="60" w:type="dxa"/>
-              <w:bottom w:w="60" w:type="dxa"/>
-              <w:left w:w="40" w:type="dxa"/>
-              <w:right w:w="40" w:type="dxa"/>
-            </w:tcMar>
-          </w:tcPr>
-          <w:p>
-            <w:pPr>
-              <w:jc w:val="center"/>
-            </w:pPr>
-            <w:r>
-              <w:rPr>
-                <w:b/>
-                <w:sz w:val="15"/>
-              </w:rPr>
-              <w:t>FP</w:t>
-            </w:r>
-          </w:p>
-        </w:tc>
-      </w:tr>
-      <w:tr>
-        <w:trPr>
-          <w:cantSplit/>
-        </w:trPr>
-        <w:tc>
-          <w:tcPr>
-            <w:tcW w:type="dxa" w:w="1888"/>
-            <w:vMerge/>
-          </w:tcPr>
-          <w:p/>
-        </w:tc>
-        <w:tc>
-          <w:tcPr>
-            <w:tcW w:type="dxa" w:w="1888"/>
-            <w:vMerge/>
-          </w:tcPr>
-          <w:p/>
-        </w:tc>
-        <w:tc>
-          <w:tcPr>
-            <w:tcW w:type="dxa" w:w="3888"/>
-            <w:tcMar>
-              <w:top w:w="60" w:type="dxa"/>
-              <w:bottom w:w="60" w:type="dxa"/>
-              <w:left w:w="60" w:type="dxa"/>
-              <w:right w:w="60" w:type="dxa"/>
-            </w:tcMar>
-          </w:tcPr>
-          <w:p>
-            <w:r>
-              <w:rPr>
-                <w:sz w:val="16"/>
-              </w:rPr>
-              <w:t>8.2.3. Acquérir des équipements de tri et un dispositif de pesée / tonnage des DBM :</w:t>
-              <w:br/>
-              <w:t>- Acquérir 50 poubelles à pédale réglementaires aux couleurs normatives (jaunes et noires)</w:t>
-              <w:br/>
-              <w:t>- Acquérir 1 peson/balance industrielle pour le pesage journalier et le suivi du tonnage des DBM</w:t>
-            </w:r>
-          </w:p>
-        </w:tc>
-        <w:tc>
-          <w:tcPr>
-            <w:tcW w:type="dxa" w:w="1296"/>
-            <w:tcMar>
-              <w:top w:w="60" w:type="dxa"/>
-              <w:bottom w:w="60" w:type="dxa"/>
-              <w:left w:w="40" w:type="dxa"/>
-              <w:right w:w="40" w:type="dxa"/>
-            </w:tcMar>
-          </w:tcPr>
-          <w:p>
-            <w:pPr>
-              <w:jc w:val="center"/>
-            </w:pPr>
-            <w:r>
-              <w:rPr>
-                <w:sz w:val="15"/>
-              </w:rPr>
-              <w:t>DAF / Économat / EOPCI</w:t>
-            </w:r>
-          </w:p>
-        </w:tc>
-        <w:tc>
-          <w:tcPr>
-            <w:tcW w:type="dxa" w:w="1296"/>
-            <w:tcMar>
-              <w:top w:w="60" w:type="dxa"/>
-              <w:bottom w:w="60" w:type="dxa"/>
-              <w:left w:w="40" w:type="dxa"/>
-              <w:right w:w="40" w:type="dxa"/>
-            </w:tcMar>
-          </w:tcPr>
-          <w:p>
-            <w:pPr>
-              <w:jc w:val="center"/>
-            </w:pPr>
-            <w:r>
-              <w:rPr>
-                <w:sz w:val="15"/>
-              </w:rPr>
-              <w:t>Novembre - Décembre 2026</w:t>
-            </w:r>
-          </w:p>
-        </w:tc>
-        <w:tc>
-          <w:tcPr>
-            <w:tcW w:type="dxa" w:w="2016"/>
-            <w:tcMar>
-              <w:top w:w="60" w:type="dxa"/>
-              <w:bottom w:w="60" w:type="dxa"/>
-              <w:left w:w="60" w:type="dxa"/>
-              <w:right w:w="60" w:type="dxa"/>
-            </w:tcMar>
-          </w:tcPr>
-          <w:p>
-            <w:r>
-              <w:rPr>
-                <w:sz w:val="15"/>
-              </w:rPr>
-              <w:t>Poubelles vétustes, absence de pédale sur plusieurs postes, absence de pesée systématique</w:t>
-            </w:r>
-          </w:p>
-        </w:tc>
-        <w:tc>
-          <w:tcPr>
-            <w:tcW w:type="dxa" w:w="2160"/>
-            <w:tcMar>
-              <w:top w:w="60" w:type="dxa"/>
-              <w:bottom w:w="60" w:type="dxa"/>
-              <w:left w:w="60" w:type="dxa"/>
-              <w:right w:w="60" w:type="dxa"/>
-            </w:tcMar>
-          </w:tcPr>
-          <w:p>
-            <w:r>
-              <w:rPr>
-                <w:sz w:val="15"/>
-              </w:rPr>
-              <w:t>50 poubelles à pédale neuves réparties dans les unités et 1 système de pesage/tonnage fonctionnel</w:t>
+              <w:t>Grilles d'inventaire trimestrielles ; 50 poubelles à pédale neuves et 1 système de pesage/tonnage fonctionnels</w:t>
             </w:r>
           </w:p>
         </w:tc>
@@ -8262,7 +8606,7 @@
               <w:rPr>
                 <w:sz w:val="16"/>
               </w:rPr>
-              <w:t>8.3.4. Assurer la dotation annuelle en consommables d'hygiène et fournitures ordinaires indispensables au fonctionnement du CLIN/PCI :</w:t>
+              <w:t>8.3.4. Superviser la dotation annuelle en consommables d'hygiène et fournitures ordinaires indispensables au fonctionnement du CLIN/PCI :</w:t>
               <w:br/>
               <w:t>- Savon liquide pour le lavage des mains (250 Litres)</w:t>
               <w:br/>
@@ -8351,6 +8695,615 @@
                 <w:sz w:val="15"/>
               </w:rPr>
               <w:t>Zéro rupture de stock en savon liquide et essuie-mains constatée dans les blocs et unités critiques</w:t>
+            </w:r>
+          </w:p>
+        </w:tc>
+        <w:tc>
+          <w:tcPr>
+            <w:tcW w:type="dxa" w:w="1152"/>
+            <w:tcMar>
+              <w:top w:w="60" w:type="dxa"/>
+              <w:bottom w:w="60" w:type="dxa"/>
+              <w:left w:w="40" w:type="dxa"/>
+              <w:right w:w="40" w:type="dxa"/>
+            </w:tcMar>
+          </w:tcPr>
+          <w:p>
+            <w:pPr>
+              <w:jc w:val="center"/>
+            </w:pPr>
+            <w:r>
+              <w:rPr>
+                <w:b/>
+                <w:sz w:val="15"/>
+              </w:rPr>
+              <w:t>FP</w:t>
+            </w:r>
+          </w:p>
+        </w:tc>
+      </w:tr>
+      <w:tr>
+        <w:trPr>
+          <w:cantSplit/>
+        </w:trPr>
+        <w:tc>
+          <w:tcPr>
+            <w:tcW w:type="dxa" w:w="1872"/>
+            <w:vMerge w:val="restart"/>
+            <w:shd w:fill="D9E1F2"/>
+            <w:tcMar>
+              <w:top w:w="60" w:type="dxa"/>
+              <w:bottom w:w="60" w:type="dxa"/>
+              <w:left w:w="60" w:type="dxa"/>
+              <w:right w:w="60" w:type="dxa"/>
+            </w:tcMar>
+          </w:tcPr>
+          <w:p>
+            <w:r>
+              <w:rPr>
+                <w:b/>
+                <w:color w:val="1B365D"/>
+                <w:sz w:val="17"/>
+              </w:rPr>
+              <w:t>VI. COMMUNICATION ET OUTILS DE SENSIBILISATION PCI</w:t>
+            </w:r>
+          </w:p>
+        </w:tc>
+        <w:tc>
+          <w:tcPr>
+            <w:tcW w:type="dxa" w:w="2304"/>
+            <w:vMerge w:val="restart"/>
+            <w:shd w:fill="F2F2F2"/>
+            <w:tcMar>
+              <w:top w:w="60" w:type="dxa"/>
+              <w:bottom w:w="60" w:type="dxa"/>
+              <w:left w:w="60" w:type="dxa"/>
+              <w:right w:w="60" w:type="dxa"/>
+            </w:tcMar>
+          </w:tcPr>
+          <w:p>
+            <w:r>
+              <w:rPr>
+                <w:b/>
+                <w:sz w:val="15"/>
+              </w:rPr>
+              <w:t>Mettre en place des outils de communication de la PCI</w:t>
+            </w:r>
+          </w:p>
+        </w:tc>
+        <w:tc>
+          <w:tcPr>
+            <w:tcW w:type="dxa" w:w="3888"/>
+            <w:tcMar>
+              <w:top w:w="60" w:type="dxa"/>
+              <w:bottom w:w="60" w:type="dxa"/>
+              <w:left w:w="60" w:type="dxa"/>
+              <w:right w:w="60" w:type="dxa"/>
+            </w:tcMar>
+          </w:tcPr>
+          <w:p>
+            <w:r>
+              <w:rPr>
+                <w:sz w:val="16"/>
+              </w:rPr>
+              <w:t>6.1.1. Élaboration des outils de communication sur l’hygiène hospitalière et la PCI (Affiches, affichettes, dépliants) :</w:t>
+              <w:br/>
+              <w:t>- Affiches des 5 indications d'hygiène des mains</w:t>
+              <w:br/>
+              <w:t>- Affiches du code couleur pour le tri des DBM</w:t>
+              <w:br/>
+              <w:t>- Dépliants d'information des usagers et visiteurs</w:t>
+            </w:r>
+          </w:p>
+        </w:tc>
+        <w:tc>
+          <w:tcPr>
+            <w:tcW w:type="dxa" w:w="1296"/>
+            <w:tcMar>
+              <w:top w:w="60" w:type="dxa"/>
+              <w:bottom w:w="60" w:type="dxa"/>
+              <w:left w:w="40" w:type="dxa"/>
+              <w:right w:w="40" w:type="dxa"/>
+            </w:tcMar>
+          </w:tcPr>
+          <w:p>
+            <w:pPr>
+              <w:jc w:val="center"/>
+            </w:pPr>
+            <w:r>
+              <w:rPr>
+                <w:sz w:val="15"/>
+              </w:rPr>
+              <w:t>EOPCI / Service Communication</w:t>
+            </w:r>
+          </w:p>
+        </w:tc>
+        <w:tc>
+          <w:tcPr>
+            <w:tcW w:type="dxa" w:w="1296"/>
+            <w:tcMar>
+              <w:top w:w="60" w:type="dxa"/>
+              <w:bottom w:w="60" w:type="dxa"/>
+              <w:left w:w="40" w:type="dxa"/>
+              <w:right w:w="40" w:type="dxa"/>
+            </w:tcMar>
+          </w:tcPr>
+          <w:p>
+            <w:pPr>
+              <w:jc w:val="center"/>
+            </w:pPr>
+            <w:r>
+              <w:rPr>
+                <w:sz w:val="15"/>
+              </w:rPr>
+              <w:t>Novembre - Décembre 2026</w:t>
+            </w:r>
+          </w:p>
+        </w:tc>
+        <w:tc>
+          <w:tcPr>
+            <w:tcW w:type="dxa" w:w="2016"/>
+            <w:tcMar>
+              <w:top w:w="60" w:type="dxa"/>
+              <w:bottom w:w="60" w:type="dxa"/>
+              <w:left w:w="60" w:type="dxa"/>
+              <w:right w:w="60" w:type="dxa"/>
+            </w:tcMar>
+          </w:tcPr>
+          <w:p>
+            <w:r>
+              <w:rPr>
+                <w:sz w:val="15"/>
+              </w:rPr>
+              <w:t>Supports visuels inexistants, dégradés ou non standardisés</w:t>
+            </w:r>
+          </w:p>
+        </w:tc>
+        <w:tc>
+          <w:tcPr>
+            <w:tcW w:type="dxa" w:w="2160"/>
+            <w:tcMar>
+              <w:top w:w="60" w:type="dxa"/>
+              <w:bottom w:w="60" w:type="dxa"/>
+              <w:left w:w="60" w:type="dxa"/>
+              <w:right w:w="60" w:type="dxa"/>
+            </w:tcMar>
+          </w:tcPr>
+          <w:p>
+            <w:r>
+              <w:rPr>
+                <w:sz w:val="15"/>
+              </w:rPr>
+              <w:t>Maquettes graphiques de 5 types d'outils et affiches validées par le CLIN</w:t>
+            </w:r>
+          </w:p>
+        </w:tc>
+        <w:tc>
+          <w:tcPr>
+            <w:tcW w:type="dxa" w:w="1152"/>
+            <w:tcMar>
+              <w:top w:w="60" w:type="dxa"/>
+              <w:bottom w:w="60" w:type="dxa"/>
+              <w:left w:w="40" w:type="dxa"/>
+              <w:right w:w="40" w:type="dxa"/>
+            </w:tcMar>
+          </w:tcPr>
+          <w:p>
+            <w:pPr>
+              <w:jc w:val="center"/>
+            </w:pPr>
+            <w:r>
+              <w:rPr>
+                <w:b/>
+                <w:sz w:val="15"/>
+              </w:rPr>
+              <w:t>FP</w:t>
+            </w:r>
+          </w:p>
+        </w:tc>
+      </w:tr>
+      <w:tr>
+        <w:trPr>
+          <w:cantSplit/>
+        </w:trPr>
+        <w:tc>
+          <w:tcPr>
+            <w:tcW w:type="dxa" w:w="1888"/>
+            <w:vMerge/>
+          </w:tcPr>
+          <w:p/>
+        </w:tc>
+        <w:tc>
+          <w:tcPr>
+            <w:tcW w:type="dxa" w:w="1888"/>
+            <w:vMerge/>
+          </w:tcPr>
+          <w:p/>
+        </w:tc>
+        <w:tc>
+          <w:tcPr>
+            <w:tcW w:type="dxa" w:w="3888"/>
+            <w:tcMar>
+              <w:top w:w="60" w:type="dxa"/>
+              <w:bottom w:w="60" w:type="dxa"/>
+              <w:left w:w="60" w:type="dxa"/>
+              <w:right w:w="60" w:type="dxa"/>
+            </w:tcMar>
+          </w:tcPr>
+          <w:p>
+            <w:r>
+              <w:rPr>
+                <w:sz w:val="16"/>
+              </w:rPr>
+              <w:t>6.1.2. Multiplication des outils de communication (impression, reproduction et plastification)</w:t>
+            </w:r>
+          </w:p>
+        </w:tc>
+        <w:tc>
+          <w:tcPr>
+            <w:tcW w:type="dxa" w:w="1296"/>
+            <w:tcMar>
+              <w:top w:w="60" w:type="dxa"/>
+              <w:bottom w:w="60" w:type="dxa"/>
+              <w:left w:w="40" w:type="dxa"/>
+              <w:right w:w="40" w:type="dxa"/>
+            </w:tcMar>
+          </w:tcPr>
+          <w:p>
+            <w:pPr>
+              <w:jc w:val="center"/>
+            </w:pPr>
+            <w:r>
+              <w:rPr>
+                <w:sz w:val="15"/>
+              </w:rPr>
+              <w:t>DAF / Économat / EOPCI</w:t>
+            </w:r>
+          </w:p>
+        </w:tc>
+        <w:tc>
+          <w:tcPr>
+            <w:tcW w:type="dxa" w:w="1296"/>
+            <w:tcMar>
+              <w:top w:w="60" w:type="dxa"/>
+              <w:bottom w:w="60" w:type="dxa"/>
+              <w:left w:w="40" w:type="dxa"/>
+              <w:right w:w="40" w:type="dxa"/>
+            </w:tcMar>
+          </w:tcPr>
+          <w:p>
+            <w:pPr>
+              <w:jc w:val="center"/>
+            </w:pPr>
+            <w:r>
+              <w:rPr>
+                <w:sz w:val="15"/>
+              </w:rPr>
+              <w:t>Janvier - Février 2027</w:t>
+            </w:r>
+          </w:p>
+        </w:tc>
+        <w:tc>
+          <w:tcPr>
+            <w:tcW w:type="dxa" w:w="2016"/>
+            <w:tcMar>
+              <w:top w:w="60" w:type="dxa"/>
+              <w:bottom w:w="60" w:type="dxa"/>
+              <w:left w:w="60" w:type="dxa"/>
+              <w:right w:w="60" w:type="dxa"/>
+            </w:tcMar>
+          </w:tcPr>
+          <w:p>
+            <w:r>
+              <w:rPr>
+                <w:sz w:val="15"/>
+              </w:rPr>
+              <w:t>Nombre insuffisant de supports imprimés</w:t>
+            </w:r>
+          </w:p>
+        </w:tc>
+        <w:tc>
+          <w:tcPr>
+            <w:tcW w:type="dxa" w:w="2160"/>
+            <w:tcMar>
+              <w:top w:w="60" w:type="dxa"/>
+              <w:bottom w:w="60" w:type="dxa"/>
+              <w:left w:w="60" w:type="dxa"/>
+              <w:right w:w="60" w:type="dxa"/>
+            </w:tcMar>
+          </w:tcPr>
+          <w:p>
+            <w:r>
+              <w:rPr>
+                <w:sz w:val="15"/>
+              </w:rPr>
+              <w:t>500 affiches et posters plastifiés et 2 000 dépliants reproduits</w:t>
+            </w:r>
+          </w:p>
+        </w:tc>
+        <w:tc>
+          <w:tcPr>
+            <w:tcW w:type="dxa" w:w="1152"/>
+            <w:tcMar>
+              <w:top w:w="60" w:type="dxa"/>
+              <w:bottom w:w="60" w:type="dxa"/>
+              <w:left w:w="40" w:type="dxa"/>
+              <w:right w:w="40" w:type="dxa"/>
+            </w:tcMar>
+          </w:tcPr>
+          <w:p>
+            <w:pPr>
+              <w:jc w:val="center"/>
+            </w:pPr>
+            <w:r>
+              <w:rPr>
+                <w:b/>
+                <w:sz w:val="15"/>
+              </w:rPr>
+              <w:t>FP</w:t>
+            </w:r>
+          </w:p>
+        </w:tc>
+      </w:tr>
+      <w:tr>
+        <w:trPr>
+          <w:cantSplit/>
+        </w:trPr>
+        <w:tc>
+          <w:tcPr>
+            <w:tcW w:type="dxa" w:w="1888"/>
+            <w:vMerge/>
+          </w:tcPr>
+          <w:p/>
+        </w:tc>
+        <w:tc>
+          <w:tcPr>
+            <w:tcW w:type="dxa" w:w="1888"/>
+            <w:vMerge/>
+          </w:tcPr>
+          <w:p/>
+        </w:tc>
+        <w:tc>
+          <w:tcPr>
+            <w:tcW w:type="dxa" w:w="3888"/>
+            <w:tcMar>
+              <w:top w:w="60" w:type="dxa"/>
+              <w:bottom w:w="60" w:type="dxa"/>
+              <w:left w:w="60" w:type="dxa"/>
+              <w:right w:w="60" w:type="dxa"/>
+            </w:tcMar>
+          </w:tcPr>
+          <w:p>
+            <w:r>
+              <w:rPr>
+                <w:sz w:val="16"/>
+              </w:rPr>
+              <w:t>6.1.3. Diffuser et installer les outils de communication dans tous les services et points de soins</w:t>
+            </w:r>
+          </w:p>
+        </w:tc>
+        <w:tc>
+          <w:tcPr>
+            <w:tcW w:type="dxa" w:w="1296"/>
+            <w:tcMar>
+              <w:top w:w="60" w:type="dxa"/>
+              <w:bottom w:w="60" w:type="dxa"/>
+              <w:left w:w="40" w:type="dxa"/>
+              <w:right w:w="40" w:type="dxa"/>
+            </w:tcMar>
+          </w:tcPr>
+          <w:p>
+            <w:pPr>
+              <w:jc w:val="center"/>
+            </w:pPr>
+            <w:r>
+              <w:rPr>
+                <w:sz w:val="15"/>
+              </w:rPr>
+              <w:t>EOPCI / Points focaux / Majors des services</w:t>
+            </w:r>
+          </w:p>
+        </w:tc>
+        <w:tc>
+          <w:tcPr>
+            <w:tcW w:type="dxa" w:w="1296"/>
+            <w:tcMar>
+              <w:top w:w="60" w:type="dxa"/>
+              <w:bottom w:w="60" w:type="dxa"/>
+              <w:left w:w="40" w:type="dxa"/>
+              <w:right w:w="40" w:type="dxa"/>
+            </w:tcMar>
+          </w:tcPr>
+          <w:p>
+            <w:pPr>
+              <w:jc w:val="center"/>
+            </w:pPr>
+            <w:r>
+              <w:rPr>
+                <w:sz w:val="15"/>
+              </w:rPr>
+              <w:t>Février - Mars 2027</w:t>
+            </w:r>
+          </w:p>
+        </w:tc>
+        <w:tc>
+          <w:tcPr>
+            <w:tcW w:type="dxa" w:w="2016"/>
+            <w:tcMar>
+              <w:top w:w="60" w:type="dxa"/>
+              <w:bottom w:w="60" w:type="dxa"/>
+              <w:left w:w="60" w:type="dxa"/>
+              <w:right w:w="60" w:type="dxa"/>
+            </w:tcMar>
+          </w:tcPr>
+          <w:p>
+            <w:r>
+              <w:rPr>
+                <w:sz w:val="15"/>
+              </w:rPr>
+              <w:t>Supports non affichés aux points critiques de soins</w:t>
+            </w:r>
+          </w:p>
+        </w:tc>
+        <w:tc>
+          <w:tcPr>
+            <w:tcW w:type="dxa" w:w="2160"/>
+            <w:tcMar>
+              <w:top w:w="60" w:type="dxa"/>
+              <w:bottom w:w="60" w:type="dxa"/>
+              <w:left w:w="60" w:type="dxa"/>
+              <w:right w:w="60" w:type="dxa"/>
+            </w:tcMar>
+          </w:tcPr>
+          <w:p>
+            <w:r>
+              <w:rPr>
+                <w:sz w:val="15"/>
+              </w:rPr>
+              <w:t>100% des postes de soins, lavabos et chambres équipés de supports visuels pérennes</w:t>
+            </w:r>
+          </w:p>
+        </w:tc>
+        <w:tc>
+          <w:tcPr>
+            <w:tcW w:type="dxa" w:w="1152"/>
+            <w:tcMar>
+              <w:top w:w="60" w:type="dxa"/>
+              <w:bottom w:w="60" w:type="dxa"/>
+              <w:left w:w="40" w:type="dxa"/>
+              <w:right w:w="40" w:type="dxa"/>
+            </w:tcMar>
+          </w:tcPr>
+          <w:p>
+            <w:pPr>
+              <w:jc w:val="center"/>
+            </w:pPr>
+            <w:r>
+              <w:rPr>
+                <w:b/>
+                <w:sz w:val="15"/>
+              </w:rPr>
+              <w:t>FP</w:t>
+            </w:r>
+          </w:p>
+        </w:tc>
+      </w:tr>
+      <w:tr>
+        <w:trPr>
+          <w:cantSplit/>
+        </w:trPr>
+        <w:tc>
+          <w:tcPr>
+            <w:tcW w:type="dxa" w:w="1888"/>
+            <w:vMerge/>
+          </w:tcPr>
+          <w:p/>
+        </w:tc>
+        <w:tc>
+          <w:tcPr>
+            <w:tcW w:type="dxa" w:w="1888"/>
+            <w:vMerge/>
+          </w:tcPr>
+          <w:p/>
+        </w:tc>
+        <w:tc>
+          <w:tcPr>
+            <w:tcW w:type="dxa" w:w="3888"/>
+            <w:tcMar>
+              <w:top w:w="60" w:type="dxa"/>
+              <w:bottom w:w="60" w:type="dxa"/>
+              <w:left w:w="60" w:type="dxa"/>
+              <w:right w:w="60" w:type="dxa"/>
+            </w:tcMar>
+          </w:tcPr>
+          <w:p>
+            <w:r>
+              <w:rPr>
+                <w:sz w:val="16"/>
+              </w:rPr>
+              <w:t>6.1.4. Conduire des campagnes de sensibilisation de proximité auprès du personnel soignant, usagers et visiteurs</w:t>
+            </w:r>
+          </w:p>
+        </w:tc>
+        <w:tc>
+          <w:tcPr>
+            <w:tcW w:type="dxa" w:w="1296"/>
+            <w:tcMar>
+              <w:top w:w="60" w:type="dxa"/>
+              <w:bottom w:w="60" w:type="dxa"/>
+              <w:left w:w="40" w:type="dxa"/>
+              <w:right w:w="40" w:type="dxa"/>
+            </w:tcMar>
+          </w:tcPr>
+          <w:p>
+            <w:pPr>
+              <w:jc w:val="center"/>
+            </w:pPr>
+            <w:r>
+              <w:rPr>
+                <w:sz w:val="15"/>
+              </w:rPr>
+              <w:t>EOPCI / Points focaux</w:t>
+            </w:r>
+          </w:p>
+        </w:tc>
+        <w:tc>
+          <w:tcPr>
+            <w:tcW w:type="dxa" w:w="1296"/>
+            <w:tcMar>
+              <w:top w:w="60" w:type="dxa"/>
+              <w:bottom w:w="60" w:type="dxa"/>
+              <w:left w:w="40" w:type="dxa"/>
+              <w:right w:w="40" w:type="dxa"/>
+            </w:tcMar>
+          </w:tcPr>
+          <w:p>
+            <w:pPr>
+              <w:jc w:val="center"/>
+            </w:pPr>
+            <w:r>
+              <w:rPr>
+                <w:sz w:val="15"/>
+              </w:rPr>
+              <w:t>Trimestriel (Continu)</w:t>
+            </w:r>
+          </w:p>
+        </w:tc>
+        <w:tc>
+          <w:tcPr>
+            <w:tcW w:type="dxa" w:w="2016"/>
+            <w:tcMar>
+              <w:top w:w="60" w:type="dxa"/>
+              <w:bottom w:w="60" w:type="dxa"/>
+              <w:left w:w="60" w:type="dxa"/>
+              <w:right w:w="60" w:type="dxa"/>
+            </w:tcMar>
+          </w:tcPr>
+          <w:p>
+            <w:r>
+              <w:rPr>
+                <w:sz w:val="15"/>
+              </w:rPr>
+              <w:t>Adhésion variable aux règles d'hygiène</w:t>
+            </w:r>
+          </w:p>
+        </w:tc>
+        <w:tc>
+          <w:tcPr>
+            <w:tcW w:type="dxa" w:w="2160"/>
+            <w:tcMar>
+              <w:top w:w="60" w:type="dxa"/>
+              <w:bottom w:w="60" w:type="dxa"/>
+              <w:left w:w="60" w:type="dxa"/>
+              <w:right w:w="60" w:type="dxa"/>
+            </w:tcMar>
+          </w:tcPr>
+          <w:p>
+            <w:r>
+              <w:rPr>
+                <w:sz w:val="15"/>
+              </w:rPr>
+              <w:t>4 campagnes institutionnelles de communication menées avec renforcement de la culture de sécurité</w:t>
             </w:r>
           </w:p>
         </w:tc>
@@ -8394,7 +9347,7 @@
           <w:color w:val="1B365D"/>
           <w:sz w:val="22"/>
         </w:rPr>
-        <w:t>3. Validation et Approbation Institutionnelle</w:t>
+        <w:t>3. Approbation Institutionnelle du Plan Réajusté</w:t>
         <w:br/>
       </w:r>
     </w:p>

</xml_diff>